<commit_message>
Deploying to gh-pages from @ kyungtacklee/kyungtacklee.github.io@165099d31e8473f39a1fa0723ad31570257ef6d0 🚀
</commit_message>
<xml_diff>
--- a/output/docx/Kyungtack_Lee_Resume.docx
+++ b/output/docx/Kyungtack_Lee_Resume.docx
@@ -1,827 +1,1698 @@
 
 <file path=word/document.xml><?xml version="1.0" encoding="utf-8"?>
-<w:document xmlns:wpc="http://schemas.microsoft.com/office/word/2010/wordprocessingCanvas" xmlns:cx="http://schemas.microsoft.com/office/drawing/2014/chartex" xmlns:cx1="http://schemas.microsoft.com/office/drawing/2015/9/8/chartex" xmlns:cx2="http://schemas.microsoft.com/office/drawing/2015/10/21/chartex" xmlns:cx3="http://schemas.microsoft.com/office/drawing/2016/5/9/chartex" xmlns:cx4="http://schemas.microsoft.com/office/drawing/2016/5/10/chartex" xmlns:cx5="http://schemas.microsoft.com/office/drawing/2016/5/11/chartex" xmlns:cx6="http://schemas.microsoft.com/office/drawing/2016/5/12/chartex" xmlns:cx7="http://schemas.microsoft.com/office/drawing/2016/5/13/chartex" xmlns:cx8="http://schemas.microsoft.com/office/drawing/2016/5/14/chartex" xmlns:mc="http://schemas.openxmlformats.org/markup-compatibility/2006" xmlns:m="http://schemas.openxmlformats.org/officeDocument/2006/math" xmlns:aink="http://schemas.microsoft.com/office/drawing/2016/ink" xmlns:am3d="http://schemas.microsoft.com/office/drawing/2017/model3d" xmlns:oel="http://schemas.microsoft.com/office/2019/extlst" xmlns:r="http://schemas.openxmlformats.org/officeDocument/2006/relationships" xmlns:wp14="http://schemas.microsoft.com/office/word/2010/wordprocessingDrawing" xmlns:wp="http://schemas.openxmlformats.org/drawingml/2006/wordprocessingDrawing" xmlns:wpg="http://schemas.microsoft.com/office/word/2010/wordprocessingGroup" xmlns:wpi="http://schemas.microsoft.com/office/word/2010/wordprocessingInk" xmlns:wps="http://schemas.microsoft.com/office/word/2010/wordprocessingShape" xmlns:o="urn:schemas-microsoft-com:office:office" xmlns:v="urn:schemas-microsoft-com:vml" xmlns:w10="urn:schemas-microsoft-com:office:word" xmlns:w="http://schemas.openxmlformats.org/wordprocessingml/2006/main" xmlns:w14="http://schemas.microsoft.com/office/word/2010/wordml" xmlns:w15="http://schemas.microsoft.com/office/word/2012/wordml" xmlns:w16cei="http://schemas.microsoft.com/office/word/2026/wordml/cei" xmlns:w16cex="http://schemas.microsoft.com/office/word/2018/wordml/cex" xmlns:w16cid="http://schemas.microsoft.com/office/word/2016/wordml/cid" xmlns:w16="http://schemas.microsoft.com/office/word/2018/wordml" xmlns:w16sdtdh="http://schemas.microsoft.com/office/word/2020/wordml/sdtdatahash" xmlns:w16sdtfl="http://schemas.microsoft.com/office/word/2024/wordml/sdtformatlock" xmlns:w16se="http://schemas.microsoft.com/office/word/2015/wordml/symex" xmlns:w16du="http://schemas.microsoft.com/office/word/2023/wordml/word16du" xmlns:wne="http://schemas.microsoft.com/office/word/2006/wordml" mc:Ignorable="w14 w15 w16se w16cid w16 w16cex w16sdtdh w16sdtfl w16du wp14">
+<w:document xmlns:wpc="http://schemas.microsoft.com/office/word/2010/wordprocessingCanvas" xmlns:cx="http://schemas.microsoft.com/office/drawing/2014/chartex" xmlns:cx1="http://schemas.microsoft.com/office/drawing/2015/9/8/chartex" xmlns:cx2="http://schemas.microsoft.com/office/drawing/2015/10/21/chartex" xmlns:cx3="http://schemas.microsoft.com/office/drawing/2016/5/9/chartex" xmlns:cx4="http://schemas.microsoft.com/office/drawing/2016/5/10/chartex" xmlns:cx5="http://schemas.microsoft.com/office/drawing/2016/5/11/chartex" xmlns:cx6="http://schemas.microsoft.com/office/drawing/2016/5/12/chartex" xmlns:cx7="http://schemas.microsoft.com/office/drawing/2016/5/13/chartex" xmlns:cx8="http://schemas.microsoft.com/office/drawing/2016/5/14/chartex" xmlns:mc="http://schemas.openxmlformats.org/markup-compatibility/2006" xmlns:m="http://schemas.openxmlformats.org/officeDocument/2006/math" xmlns:aink="http://schemas.microsoft.com/office/drawing/2016/ink" xmlns:am3d="http://schemas.microsoft.com/office/drawing/2017/model3d" xmlns:oel="http://schemas.microsoft.com/office/2019/extlst" xmlns:r="http://schemas.openxmlformats.org/officeDocument/2006/relationships" xmlns:wp14="http://schemas.microsoft.com/office/word/2010/wordprocessingDrawing" xmlns:wp="http://schemas.openxmlformats.org/drawingml/2006/wordprocessingDrawing" xmlns:wpg="http://schemas.microsoft.com/office/word/2010/wordprocessingGroup" xmlns:wpi="http://schemas.microsoft.com/office/word/2010/wordprocessingInk" xmlns:wps="http://schemas.microsoft.com/office/word/2010/wordprocessingShape" xmlns:o="urn:schemas-microsoft-com:office:office" xmlns:v="urn:schemas-microsoft-com:vml" xmlns:w10="urn:schemas-microsoft-com:office:word" xmlns:w="http://schemas.openxmlformats.org/wordprocessingml/2006/main" xmlns:w14="http://schemas.microsoft.com/office/word/2010/wordml" xmlns:w15="http://schemas.microsoft.com/office/word/2012/wordml" xmlns:w16cex="http://schemas.microsoft.com/office/word/2018/wordml/cex" xmlns:w16cid="http://schemas.microsoft.com/office/word/2016/wordml/cid" xmlns:w16="http://schemas.microsoft.com/office/word/2018/wordml" xmlns:w16sdtdh="http://schemas.microsoft.com/office/word/2020/wordml/sdtdatahash" xmlns:w16sdtfl="http://schemas.microsoft.com/office/word/2024/wordml/sdtformatlock" xmlns:w16se="http://schemas.microsoft.com/office/word/2015/wordml/symex" xmlns:w16du="http://schemas.microsoft.com/office/word/2023/wordml/word16du" xmlns:wne="http://schemas.microsoft.com/office/word/2006/wordml" mc:Ignorable="w14 w15 w16se w16cid w16 w16cex w16sdtdh w16sdtfl w16du wp14">
   <w:body>
     <w:p>
       <w:pPr>
-        <w:pStyle w:val="ResumeName"/>
-        <w:spacing w:line="312" w:lineRule="auto"/>
-        <w:rPr>
-          <w:rFonts w:hint="eastAsia"/>
+        <w:pStyle w:val="Title"/>
+        <w:spacing w:line="276" w:lineRule="auto"/>
+        <w:rPr>
+          <w:rFonts w:cstheme="majorHAnsi"/>
+          <w:sz w:val="48"/>
+          <w:szCs w:val="56"/>
+        </w:rPr>
+      </w:pPr>
+      <w:r>
+        <w:rPr>
+          <w:rFonts w:ascii="Malgun Gothic" w:eastAsia="Malgun Gothic" w:hAnsi="Malgun Gothic" w:cs="Malgun Gothic" w:hint="eastAsia"/>
+          <w:sz w:val="40"/>
+          <w:szCs w:val="48"/>
           <w:lang w:eastAsia="ko-KR"/>
         </w:rPr>
-      </w:pPr>
+        <w:t xml:space="preserve">이경택 </w:t>
+      </w:r>
       <w:r>
+        <w:rPr>
+          <w:rFonts w:cstheme="majorHAnsi"/>
+          <w:sz w:val="48"/>
+          <w:szCs w:val="56"/>
+        </w:rPr>
         <w:t>Kyungtack Lee</w:t>
       </w:r>
     </w:p>
     <w:p>
       <w:pPr>
-        <w:pStyle w:val="ResumeTagline"/>
-        <w:spacing w:line="312" w:lineRule="auto"/>
+        <w:spacing w:line="276" w:lineRule="auto"/>
+        <w:rPr>
+          <w:rFonts w:asciiTheme="majorHAnsi" w:hAnsiTheme="majorHAnsi" w:cstheme="majorHAnsi"/>
+          <w:sz w:val="20"/>
+          <w:szCs w:val="24"/>
+        </w:rPr>
       </w:pPr>
       <w:r>
-        <w:t xml:space="preserve">VEHICLE MOTION </w:t>
+        <w:rPr>
+          <w:rFonts w:asciiTheme="majorHAnsi" w:hAnsiTheme="majorHAnsi" w:cstheme="majorHAnsi"/>
+          <w:b/>
+          <w:color w:val="5B5BD6"/>
+          <w:sz w:val="21"/>
+          <w:szCs w:val="24"/>
+        </w:rPr>
+        <w:t xml:space="preserve">Vehicle Dynamics </w:t>
       </w:r>
       <w:r>
-        <w:t xml:space="preserve">PLANNING &amp; </w:t>
+        <w:rPr>
+          <w:rFonts w:asciiTheme="majorHAnsi" w:hAnsiTheme="majorHAnsi" w:cstheme="majorHAnsi"/>
+          <w:b/>
+          <w:color w:val="5B5BD6"/>
+          <w:sz w:val="21"/>
+          <w:szCs w:val="24"/>
+        </w:rPr>
+        <w:t>&amp;</w:t>
       </w:r>
       <w:r>
-        <w:t>CONTROL ENGINEER</w:t>
+        <w:rPr>
+          <w:rFonts w:asciiTheme="majorHAnsi" w:hAnsiTheme="majorHAnsi" w:cstheme="majorHAnsi"/>
+          <w:b/>
+          <w:color w:val="5B5BD6"/>
+          <w:sz w:val="21"/>
+          <w:szCs w:val="24"/>
+        </w:rPr>
+        <w:t xml:space="preserve"> Control | Path Planning </w:t>
+      </w:r>
+      <w:r>
+        <w:rPr>
+          <w:rFonts w:asciiTheme="majorHAnsi" w:hAnsiTheme="majorHAnsi" w:cstheme="majorHAnsi"/>
+          <w:b/>
+          <w:color w:val="5B5BD6"/>
+          <w:sz w:val="21"/>
+          <w:szCs w:val="24"/>
+        </w:rPr>
+        <w:t>&amp;</w:t>
+      </w:r>
+      <w:r>
+        <w:rPr>
+          <w:rFonts w:asciiTheme="majorHAnsi" w:hAnsiTheme="majorHAnsi" w:cstheme="majorHAnsi"/>
+          <w:b/>
+          <w:color w:val="5B5BD6"/>
+          <w:sz w:val="21"/>
+          <w:szCs w:val="24"/>
+        </w:rPr>
+        <w:t xml:space="preserve"> Tracking Control</w:t>
       </w:r>
     </w:p>
     <w:p>
       <w:pPr>
-        <w:pStyle w:val="ResumeContact"/>
-        <w:spacing w:line="312" w:lineRule="auto"/>
+        <w:spacing w:line="276" w:lineRule="auto"/>
+        <w:rPr>
+          <w:rFonts w:asciiTheme="majorHAnsi" w:hAnsiTheme="majorHAnsi" w:cstheme="majorHAnsi"/>
+          <w:sz w:val="20"/>
+          <w:szCs w:val="24"/>
+        </w:rPr>
       </w:pPr>
       <w:r>
-        <w:t xml:space="preserve">Seoul, Republic of Korea | +82 10-2632-3242 | </w:t>
+        <w:rPr>
+          <w:rFonts w:asciiTheme="majorHAnsi" w:hAnsiTheme="majorHAnsi" w:cstheme="majorHAnsi"/>
+          <w:color w:val="56616D"/>
+          <w:szCs w:val="24"/>
+        </w:rPr>
+        <w:t>kyungtacklee.github.io | kyungtacklee@gmail.com | +82 10-2632-3242</w:t>
       </w:r>
-      <w:hyperlink r:id="rId8">
-        <w:r>
-          <w:t>kyungtacklee@gmail.com</w:t>
-        </w:r>
-      </w:hyperlink>
-      <w:r>
-        <w:t xml:space="preserve"> | </w:t>
-      </w:r>
-      <w:hyperlink r:id="rId9">
-        <w:r>
-          <w:t>kyungtacklee.github.io</w:t>
-        </w:r>
-      </w:hyperlink>
     </w:p>
     <w:p>
       <w:pPr>
-        <w:pStyle w:val="ResumeSection"/>
+        <w:pStyle w:val="Heading1"/>
         <w:pBdr>
-          <w:bottom w:val="single" w:sz="6" w:space="3" w:color="5A8F00"/>
+          <w:bottom w:val="single" w:sz="6" w:space="4" w:color="5B5BD6"/>
         </w:pBdr>
-        <w:spacing w:line="312" w:lineRule="auto"/>
+        <w:spacing w:before="180" w:after="140" w:line="276" w:lineRule="auto"/>
+        <w:rPr>
+          <w:rFonts w:cstheme="majorHAnsi"/>
+          <w:sz w:val="24"/>
+          <w:szCs w:val="32"/>
+        </w:rPr>
       </w:pPr>
       <w:r>
+        <w:rPr>
+          <w:rFonts w:cstheme="majorHAnsi"/>
+          <w:sz w:val="24"/>
+          <w:szCs w:val="32"/>
+        </w:rPr>
         <w:t>PROFESSIONAL SUMMARY</w:t>
       </w:r>
     </w:p>
     <w:p>
       <w:pPr>
-        <w:spacing w:line="312" w:lineRule="auto"/>
+        <w:spacing w:line="276" w:lineRule="auto"/>
+        <w:rPr>
+          <w:rFonts w:asciiTheme="majorHAnsi" w:hAnsiTheme="majorHAnsi" w:cstheme="majorHAnsi"/>
+          <w:sz w:val="20"/>
+          <w:szCs w:val="24"/>
+        </w:rPr>
       </w:pPr>
       <w:r>
-        <w:t xml:space="preserve">Vehicle motion control and autonomous driving engineer with more than </w:t>
-      </w:r>
-      <w:r>
-        <w:t>seven</w:t>
-      </w:r>
-      <w:r>
-        <w:t xml:space="preserve"> years of experience in production automotive engineering. Technical lead and project owner for safety-critical planning and control functions, with end-to-end responsibility spanning function architecture, algorithm development, modeling and simulation, real-time implementation, vehicle integration, calibration, and validation. Expertise includes motion planning, trajectory generation and tracking, vehicle dynamics, integrated chassis control, state estimation, and optimization-based control.</w:t>
+        <w:rPr>
+          <w:rFonts w:asciiTheme="majorHAnsi" w:hAnsiTheme="majorHAnsi" w:cstheme="majorHAnsi"/>
+          <w:sz w:val="20"/>
+          <w:szCs w:val="24"/>
+        </w:rPr>
+        <w:t>Vehicle dynamics and control engineer with more than ten years of experience in automotive engineering. Technical lead and project owner for safety-critical vehicle control functions, with end-to-end responsibility for function architecture, algorithm development, modeling and simulation, real-time implementation, vehicle integration, calibration, and validation. Expertise includes vehicle dynamics, integrated chassis control, state estimation, and nonlinear and optimal control.</w:t>
       </w:r>
     </w:p>
     <w:p>
       <w:pPr>
-        <w:pStyle w:val="ResumeSection"/>
+        <w:pStyle w:val="Heading1"/>
         <w:pBdr>
-          <w:bottom w:val="single" w:sz="6" w:space="3" w:color="5A8F00"/>
+          <w:bottom w:val="single" w:sz="6" w:space="4" w:color="5B5BD6"/>
         </w:pBdr>
-        <w:spacing w:line="312" w:lineRule="auto"/>
+        <w:spacing w:before="180" w:after="140" w:line="276" w:lineRule="auto"/>
+        <w:rPr>
+          <w:rFonts w:cstheme="majorHAnsi"/>
+          <w:sz w:val="24"/>
+          <w:szCs w:val="32"/>
+        </w:rPr>
       </w:pPr>
       <w:r>
+        <w:rPr>
+          <w:rFonts w:cstheme="majorHAnsi"/>
+          <w:sz w:val="24"/>
+          <w:szCs w:val="32"/>
+        </w:rPr>
         <w:t>CORE COMPETENCIES</w:t>
       </w:r>
     </w:p>
     <w:p>
       <w:pPr>
-        <w:numPr>
-          <w:ilvl w:val="0"/>
-          <w:numId w:val="1"/>
-        </w:numPr>
-        <w:spacing w:line="312" w:lineRule="auto"/>
+        <w:pStyle w:val="ListBullet"/>
+        <w:spacing w:line="276" w:lineRule="auto"/>
+        <w:rPr>
+          <w:rFonts w:asciiTheme="majorHAnsi" w:hAnsiTheme="majorHAnsi" w:cstheme="majorHAnsi"/>
+          <w:sz w:val="20"/>
+          <w:szCs w:val="24"/>
+        </w:rPr>
       </w:pPr>
       <w:r>
         <w:rPr>
+          <w:rFonts w:asciiTheme="majorHAnsi" w:hAnsiTheme="majorHAnsi" w:cstheme="majorHAnsi"/>
           <w:b/>
-        </w:rPr>
-        <w:t xml:space="preserve">Planning &amp; Control: </w:t>
+          <w:sz w:val="20"/>
+          <w:szCs w:val="24"/>
+        </w:rPr>
+        <w:t>Vehicle Dynamics &amp; Control</w:t>
       </w:r>
       <w:r>
-        <w:t>Motion planning, trajectory generation, path tracking, integrated chassis control, optimization-based control</w:t>
+        <w:rPr>
+          <w:rFonts w:asciiTheme="majorHAnsi" w:hAnsiTheme="majorHAnsi" w:cstheme="majorHAnsi"/>
+          <w:b/>
+          <w:sz w:val="20"/>
+          <w:szCs w:val="24"/>
+          <w:lang w:eastAsia="ko-KR"/>
+        </w:rPr>
+        <w:br/>
+      </w:r>
+      <w:r>
+        <w:rPr>
+          <w:rFonts w:asciiTheme="majorHAnsi" w:hAnsiTheme="majorHAnsi" w:cstheme="majorHAnsi"/>
+          <w:b/>
+          <w:sz w:val="20"/>
+          <w:szCs w:val="24"/>
+        </w:rPr>
+        <w:t>:</w:t>
+      </w:r>
+      <w:r>
+        <w:rPr>
+          <w:rFonts w:asciiTheme="majorHAnsi" w:hAnsiTheme="majorHAnsi" w:cstheme="majorHAnsi"/>
+          <w:sz w:val="20"/>
+          <w:szCs w:val="24"/>
+        </w:rPr>
+        <w:t xml:space="preserve"> MPC/MPPI-based control and trajectory tracking; sliding-mode control for yaw, sideslip, and roll stabilization; supervisory integrated chassis control; steering–brake coordination and wheel-level control allocation</w:t>
       </w:r>
     </w:p>
     <w:p>
       <w:pPr>
-        <w:numPr>
-          <w:ilvl w:val="0"/>
-          <w:numId w:val="1"/>
-        </w:numPr>
-        <w:spacing w:line="312" w:lineRule="auto"/>
+        <w:pStyle w:val="ListBullet"/>
+        <w:spacing w:line="276" w:lineRule="auto"/>
+        <w:rPr>
+          <w:rFonts w:asciiTheme="majorHAnsi" w:hAnsiTheme="majorHAnsi" w:cstheme="majorHAnsi"/>
+          <w:sz w:val="20"/>
+          <w:szCs w:val="24"/>
+        </w:rPr>
       </w:pPr>
       <w:r>
         <w:rPr>
+          <w:rFonts w:asciiTheme="majorHAnsi" w:hAnsiTheme="majorHAnsi" w:cstheme="majorHAnsi"/>
           <w:b/>
-        </w:rPr>
-        <w:t xml:space="preserve">Vehicle Engineering: </w:t>
+          <w:sz w:val="20"/>
+          <w:szCs w:val="24"/>
+        </w:rPr>
+        <w:t>Vehicle State Estimation</w:t>
       </w:r>
       <w:r>
-        <w:t>Vehicle dynamics, state estimation, actuator coordination, calibration, in-vehicle testing, recorded-data analysis</w:t>
+        <w:rPr>
+          <w:rFonts w:asciiTheme="majorHAnsi" w:hAnsiTheme="majorHAnsi" w:cstheme="majorHAnsi"/>
+          <w:b/>
+          <w:sz w:val="20"/>
+          <w:szCs w:val="24"/>
+          <w:lang w:eastAsia="ko-KR"/>
+        </w:rPr>
+        <w:br/>
+      </w:r>
+      <w:r>
+        <w:rPr>
+          <w:rFonts w:asciiTheme="majorHAnsi" w:hAnsiTheme="majorHAnsi" w:cstheme="majorHAnsi"/>
+          <w:b/>
+          <w:sz w:val="20"/>
+          <w:szCs w:val="24"/>
+        </w:rPr>
+        <w:t>:</w:t>
+      </w:r>
+      <w:r>
+        <w:rPr>
+          <w:rFonts w:asciiTheme="majorHAnsi" w:hAnsiTheme="majorHAnsi" w:cstheme="majorHAnsi"/>
+          <w:sz w:val="20"/>
+          <w:szCs w:val="24"/>
+        </w:rPr>
+        <w:t xml:space="preserve"> Sideslip and velocity estimation; Kalman filtering; sliding-mode observers; moving horizon estimation (MHE)</w:t>
       </w:r>
     </w:p>
     <w:p>
       <w:pPr>
-        <w:numPr>
-          <w:ilvl w:val="0"/>
-          <w:numId w:val="1"/>
-        </w:numPr>
-        <w:spacing w:line="312" w:lineRule="auto"/>
+        <w:pStyle w:val="ListBullet"/>
+        <w:spacing w:line="276" w:lineRule="auto"/>
+        <w:rPr>
+          <w:rFonts w:asciiTheme="majorHAnsi" w:hAnsiTheme="majorHAnsi" w:cstheme="majorHAnsi"/>
+          <w:sz w:val="20"/>
+          <w:szCs w:val="24"/>
+        </w:rPr>
       </w:pPr>
       <w:r>
         <w:rPr>
+          <w:rFonts w:asciiTheme="majorHAnsi" w:hAnsiTheme="majorHAnsi" w:cstheme="majorHAnsi"/>
           <w:b/>
-        </w:rPr>
-        <w:t xml:space="preserve">Programming: </w:t>
+          <w:sz w:val="20"/>
+          <w:szCs w:val="24"/>
+        </w:rPr>
+        <w:t>Motion Planning</w:t>
       </w:r>
       <w:r>
-        <w:t>C for production software analysis and development; MATLAB; Python</w:t>
+        <w:rPr>
+          <w:rFonts w:asciiTheme="majorHAnsi" w:hAnsiTheme="majorHAnsi" w:cstheme="majorHAnsi"/>
+          <w:b/>
+          <w:sz w:val="20"/>
+          <w:szCs w:val="24"/>
+          <w:lang w:eastAsia="ko-KR"/>
+        </w:rPr>
+        <w:br/>
+      </w:r>
+      <w:r>
+        <w:rPr>
+          <w:rFonts w:asciiTheme="majorHAnsi" w:hAnsiTheme="majorHAnsi" w:cstheme="majorHAnsi"/>
+          <w:b/>
+          <w:sz w:val="20"/>
+          <w:szCs w:val="24"/>
+        </w:rPr>
+        <w:t>:</w:t>
+      </w:r>
+      <w:r>
+        <w:rPr>
+          <w:rFonts w:asciiTheme="majorHAnsi" w:hAnsiTheme="majorHAnsi" w:cstheme="majorHAnsi"/>
+          <w:sz w:val="20"/>
+          <w:szCs w:val="24"/>
+        </w:rPr>
+        <w:t xml:space="preserve"> Continuous-curvature path generation; evasive maneuver planning; planning–control integration</w:t>
       </w:r>
     </w:p>
     <w:p>
       <w:pPr>
-        <w:numPr>
-          <w:ilvl w:val="0"/>
-          <w:numId w:val="1"/>
-        </w:numPr>
-        <w:spacing w:line="312" w:lineRule="auto"/>
+        <w:pStyle w:val="ListBullet"/>
+        <w:spacing w:line="276" w:lineRule="auto"/>
+        <w:rPr>
+          <w:rFonts w:asciiTheme="majorHAnsi" w:hAnsiTheme="majorHAnsi" w:cstheme="majorHAnsi"/>
+          <w:sz w:val="20"/>
+          <w:szCs w:val="24"/>
+        </w:rPr>
       </w:pPr>
       <w:r>
         <w:rPr>
+          <w:rFonts w:asciiTheme="majorHAnsi" w:hAnsiTheme="majorHAnsi" w:cstheme="majorHAnsi"/>
           <w:b/>
-        </w:rPr>
-        <w:t xml:space="preserve">Real-Time Development: </w:t>
+          <w:sz w:val="20"/>
+          <w:szCs w:val="24"/>
+        </w:rPr>
+        <w:t>Implementation &amp; Validation</w:t>
       </w:r>
       <w:r>
-        <w:t>MATLAB/Simulink, dSPACE MicroAutoBox II, real-time model build and deployment, rapid control prototyping</w:t>
+        <w:rPr>
+          <w:rFonts w:asciiTheme="majorHAnsi" w:hAnsiTheme="majorHAnsi" w:cstheme="majorHAnsi"/>
+          <w:b/>
+          <w:sz w:val="20"/>
+          <w:szCs w:val="24"/>
+          <w:lang w:eastAsia="ko-KR"/>
+        </w:rPr>
+        <w:br/>
+      </w:r>
+      <w:r>
+        <w:rPr>
+          <w:rFonts w:asciiTheme="majorHAnsi" w:hAnsiTheme="majorHAnsi" w:cstheme="majorHAnsi"/>
+          <w:b/>
+          <w:sz w:val="20"/>
+          <w:szCs w:val="24"/>
+        </w:rPr>
+        <w:t>:</w:t>
+      </w:r>
+      <w:r>
+        <w:rPr>
+          <w:rFonts w:asciiTheme="majorHAnsi" w:hAnsiTheme="majorHAnsi" w:cstheme="majorHAnsi"/>
+          <w:sz w:val="20"/>
+          <w:szCs w:val="24"/>
+        </w:rPr>
+        <w:t xml:space="preserve"> C, MATLAB/Simulink, Python; scenario-based simulation with CarSim, CarMaker, and CARLA; real-time prototyping with dSPACE MicroAutoBox II and Jetson AGX; vehicle integration, calibration, and testing</w:t>
       </w:r>
     </w:p>
     <w:p>
       <w:pPr>
-        <w:numPr>
-          <w:ilvl w:val="0"/>
-          <w:numId w:val="1"/>
-        </w:numPr>
-        <w:spacing w:line="312" w:lineRule="auto"/>
+        <w:pStyle w:val="Heading1"/>
+        <w:pBdr>
+          <w:bottom w:val="single" w:sz="6" w:space="4" w:color="5B5BD6"/>
+        </w:pBdr>
+        <w:spacing w:before="180" w:after="140" w:line="276" w:lineRule="auto"/>
+        <w:rPr>
+          <w:rFonts w:cstheme="majorHAnsi"/>
+          <w:sz w:val="24"/>
+          <w:szCs w:val="32"/>
+        </w:rPr>
       </w:pPr>
       <w:r>
         <w:rPr>
-          <w:b/>
-        </w:rPr>
-        <w:t xml:space="preserve">NVIDIA Platforms: </w:t>
-      </w:r>
-      <w:r>
-        <w:t>NVIDIA Jetson AGX; Isaac Sim</w:t>
-      </w:r>
-    </w:p>
-    <w:p>
-      <w:pPr>
-        <w:numPr>
-          <w:ilvl w:val="0"/>
-          <w:numId w:val="1"/>
-        </w:numPr>
-        <w:spacing w:line="312" w:lineRule="auto"/>
-      </w:pPr>
-      <w:r>
-        <w:rPr>
-          <w:b/>
-        </w:rPr>
-        <w:t xml:space="preserve">Simulation &amp; Process: </w:t>
-      </w:r>
-      <w:r>
-        <w:t>CarSim, CarMaker, AUTOSAR-aligned development, unit/integration testing; familiarity with ISO 26262, ISO 21448 SOTIF, and Automotive SPICE</w:t>
-      </w:r>
-    </w:p>
-    <w:p>
-      <w:pPr>
-        <w:pStyle w:val="ResumeSection"/>
-        <w:pBdr>
-          <w:bottom w:val="single" w:sz="6" w:space="3" w:color="5A8F00"/>
-        </w:pBdr>
-        <w:spacing w:line="312" w:lineRule="auto"/>
-      </w:pPr>
-      <w:r>
+          <w:rFonts w:cstheme="majorHAnsi"/>
+          <w:sz w:val="24"/>
+          <w:szCs w:val="32"/>
+        </w:rPr>
         <w:t>PROFESSIONAL EXPERIENCE</w:t>
       </w:r>
     </w:p>
     <w:p>
       <w:pPr>
-        <w:pStyle w:val="ResumeEntry"/>
+        <w:pStyle w:val="Heading2"/>
         <w:tabs>
-          <w:tab w:val="right" w:pos="10570"/>
+          <w:tab w:val="right" w:pos="10091"/>
         </w:tabs>
-        <w:spacing w:line="312" w:lineRule="auto"/>
+        <w:spacing w:line="276" w:lineRule="auto"/>
+        <w:rPr>
+          <w:rFonts w:cstheme="majorHAnsi"/>
+          <w:sz w:val="20"/>
+          <w:szCs w:val="28"/>
+        </w:rPr>
       </w:pPr>
       <w:r>
+        <w:rPr>
+          <w:rFonts w:cstheme="majorHAnsi"/>
+          <w:sz w:val="20"/>
+          <w:szCs w:val="28"/>
+        </w:rPr>
         <w:t>Senior Research Engineer | HL Mando</w:t>
       </w:r>
       <w:r>
         <w:rPr>
+          <w:rFonts w:cstheme="majorHAnsi"/>
+          <w:sz w:val="20"/>
+          <w:szCs w:val="28"/>
+        </w:rPr>
+        <w:tab/>
+      </w:r>
+      <w:r>
+        <w:rPr>
+          <w:rFonts w:cstheme="majorHAnsi"/>
           <w:color w:val="56616D"/>
-          <w:sz w:val="17"/>
-        </w:rPr>
-        <w:tab/>
+          <w:sz w:val="18"/>
+          <w:szCs w:val="28"/>
+        </w:rPr>
         <w:t>2015.08 - Present</w:t>
       </w:r>
     </w:p>
     <w:p>
       <w:pPr>
-        <w:numPr>
-          <w:ilvl w:val="0"/>
-          <w:numId w:val="1"/>
-        </w:numPr>
-        <w:spacing w:line="312" w:lineRule="auto"/>
+        <w:pStyle w:val="ListBullet"/>
+        <w:spacing w:line="276" w:lineRule="auto"/>
+        <w:rPr>
+          <w:rFonts w:asciiTheme="majorHAnsi" w:hAnsiTheme="majorHAnsi" w:cstheme="majorHAnsi"/>
+          <w:sz w:val="20"/>
+          <w:szCs w:val="24"/>
+        </w:rPr>
       </w:pPr>
       <w:r>
         <w:rPr>
+          <w:rFonts w:asciiTheme="majorHAnsi" w:hAnsiTheme="majorHAnsi" w:cstheme="majorHAnsi"/>
           <w:b/>
-        </w:rPr>
-        <w:t xml:space="preserve">Mobility Motion Control (2020 - Present): </w:t>
-      </w:r>
-      <w:r>
-        <w:t>Technical lead and project owner for planning and control functions including Integrated Chassis Control, Vehicle Stability Control Assist, Evasive Collision Avoidance, Smart Hitching Assist, Trailer Parking Assist, and Minimum Risk Maneuver.</w:t>
+          <w:sz w:val="20"/>
+          <w:szCs w:val="24"/>
+        </w:rPr>
+        <w:t>Vehicle Motion Control (2020 - Present):</w:t>
       </w:r>
     </w:p>
     <w:p>
       <w:pPr>
-        <w:numPr>
-          <w:ilvl w:val="0"/>
-          <w:numId w:val="1"/>
-        </w:numPr>
-        <w:spacing w:line="312" w:lineRule="auto"/>
+        <w:pStyle w:val="ListBullet2"/>
+        <w:spacing w:line="276" w:lineRule="auto"/>
+        <w:rPr>
+          <w:rFonts w:asciiTheme="majorHAnsi" w:hAnsiTheme="majorHAnsi" w:cstheme="majorHAnsi"/>
+          <w:sz w:val="20"/>
+          <w:szCs w:val="24"/>
+        </w:rPr>
       </w:pPr>
       <w:r>
-        <w:t>Lead function definition and algorithm development through simulation, real-time deployment, system integration, vehicle tuning, scenario-based testing, and measurable vehicle-level evaluation.</w:t>
+        <w:rPr>
+          <w:rFonts w:asciiTheme="majorHAnsi" w:hAnsiTheme="majorHAnsi" w:cstheme="majorHAnsi"/>
+          <w:sz w:val="20"/>
+          <w:szCs w:val="24"/>
+        </w:rPr>
+        <w:t>Serve as technical lead and project owner for vehicle control functions, including Integrated Chassis Control, Vehicle Stability Control Assist (VSCA), Evasive Collision Avoidance, Smart Hitching Assist (SHA), Trailer Parking Assist (TPA), and Integrated Chassis Control for Path Tracking and Vehicle Stability.</w:t>
       </w:r>
     </w:p>
     <w:p>
       <w:pPr>
-        <w:numPr>
-          <w:ilvl w:val="0"/>
-          <w:numId w:val="1"/>
-        </w:numPr>
-        <w:spacing w:line="312" w:lineRule="auto"/>
+        <w:pStyle w:val="ListBullet2"/>
+        <w:spacing w:line="276" w:lineRule="auto"/>
+        <w:rPr>
+          <w:rFonts w:asciiTheme="majorHAnsi" w:hAnsiTheme="majorHAnsi" w:cstheme="majorHAnsi"/>
+          <w:sz w:val="20"/>
+          <w:szCs w:val="24"/>
+        </w:rPr>
       </w:pPr>
       <w:r>
-        <w:t>Develop and analyze production software in C; build and deploy MATLAB/Simulink control models to dSPACE MicroAutoBox II; use NVIDIA Jetson AGX for vehicle evaluation.</w:t>
+        <w:rPr>
+          <w:rFonts w:asciiTheme="majorHAnsi" w:hAnsiTheme="majorHAnsi" w:cstheme="majorHAnsi"/>
+          <w:sz w:val="20"/>
+          <w:szCs w:val="24"/>
+        </w:rPr>
+        <w:t>Lead end-to-end development from function definition and algorithm design through simulation, real-time implementation, system integration, vehicle tuning, scenario-based testing, and quantitative evaluation.</w:t>
       </w:r>
     </w:p>
     <w:p>
       <w:pPr>
-        <w:numPr>
-          <w:ilvl w:val="0"/>
-          <w:numId w:val="1"/>
-        </w:numPr>
-        <w:spacing w:line="312" w:lineRule="auto"/>
+        <w:pStyle w:val="ListBullet"/>
+        <w:spacing w:line="276" w:lineRule="auto"/>
+        <w:rPr>
+          <w:rFonts w:asciiTheme="majorHAnsi" w:hAnsiTheme="majorHAnsi" w:cstheme="majorHAnsi"/>
+          <w:sz w:val="20"/>
+          <w:szCs w:val="24"/>
+        </w:rPr>
       </w:pPr>
       <w:r>
         <w:rPr>
+          <w:rFonts w:asciiTheme="majorHAnsi" w:hAnsiTheme="majorHAnsi" w:cstheme="majorHAnsi"/>
           <w:b/>
-        </w:rPr>
-        <w:t xml:space="preserve">System Design (2019 - 2020): </w:t>
-      </w:r>
-      <w:r>
-        <w:t>E-Corner Module system design and analysis.</w:t>
+          <w:sz w:val="20"/>
+          <w:szCs w:val="24"/>
+        </w:rPr>
+        <w:t>System Design and Multibody Dynamics Analysis (2015 - 2020):</w:t>
       </w:r>
     </w:p>
     <w:p>
       <w:pPr>
-        <w:numPr>
-          <w:ilvl w:val="0"/>
-          <w:numId w:val="1"/>
-        </w:numPr>
-        <w:spacing w:line="312" w:lineRule="auto"/>
+        <w:pStyle w:val="ListBullet2"/>
+        <w:spacing w:line="276" w:lineRule="auto"/>
+        <w:rPr>
+          <w:rFonts w:asciiTheme="majorHAnsi" w:hAnsiTheme="majorHAnsi" w:cstheme="majorHAnsi"/>
+          <w:sz w:val="20"/>
+          <w:szCs w:val="24"/>
+        </w:rPr>
       </w:pPr>
       <w:r>
         <w:rPr>
-          <w:b/>
-        </w:rPr>
-        <w:t xml:space="preserve">Gear Design (2015 - 2019): </w:t>
-      </w:r>
-      <w:r>
-        <w:t>Electric Power Steering, Steer-by-Wire, Shift-by-Wire, and e-Drive systems; durability analysis, optimization, and in-house engineering tool development.</w:t>
+          <w:rFonts w:asciiTheme="majorHAnsi" w:hAnsiTheme="majorHAnsi" w:cstheme="majorHAnsi"/>
+          <w:sz w:val="20"/>
+          <w:szCs w:val="24"/>
+        </w:rPr>
+        <w:t>Designed and optimized chassis systems, including Electric Power Steering and Steer-by-Wire, performed durability analyses, and developed in-house engineering tools.</w:t>
       </w:r>
     </w:p>
     <w:p>
       <w:pPr>
-        <w:pStyle w:val="ResumeEntry"/>
+        <w:pStyle w:val="ListBullet2"/>
+        <w:spacing w:line="276" w:lineRule="auto"/>
+        <w:rPr>
+          <w:rFonts w:asciiTheme="majorHAnsi" w:hAnsiTheme="majorHAnsi" w:cstheme="majorHAnsi"/>
+          <w:sz w:val="20"/>
+          <w:szCs w:val="24"/>
+        </w:rPr>
+      </w:pPr>
+      <w:r>
+        <w:rPr>
+          <w:rFonts w:asciiTheme="majorHAnsi" w:hAnsiTheme="majorHAnsi" w:cstheme="majorHAnsi"/>
+          <w:sz w:val="20"/>
+          <w:szCs w:val="24"/>
+        </w:rPr>
+        <w:t>Performed system design and multibody dynamics analysis for E-Corner modules.</w:t>
+      </w:r>
+    </w:p>
+    <w:p>
+      <w:pPr>
+        <w:pStyle w:val="Heading2"/>
         <w:tabs>
-          <w:tab w:val="right" w:pos="10570"/>
+          <w:tab w:val="right" w:pos="10091"/>
         </w:tabs>
-        <w:spacing w:line="312" w:lineRule="auto"/>
+        <w:spacing w:line="276" w:lineRule="auto"/>
+        <w:rPr>
+          <w:rFonts w:cstheme="majorHAnsi"/>
+          <w:sz w:val="20"/>
+          <w:szCs w:val="28"/>
+        </w:rPr>
       </w:pPr>
       <w:r>
+        <w:rPr>
+          <w:rFonts w:cstheme="majorHAnsi"/>
+          <w:sz w:val="20"/>
+          <w:szCs w:val="28"/>
+        </w:rPr>
         <w:t>Research Engineer | Samsung Techwin (now Hanwha Aerospace)</w:t>
       </w:r>
       <w:r>
         <w:rPr>
+          <w:rFonts w:cstheme="majorHAnsi"/>
+          <w:sz w:val="20"/>
+          <w:szCs w:val="28"/>
+        </w:rPr>
+        <w:tab/>
+      </w:r>
+      <w:r>
+        <w:rPr>
+          <w:rFonts w:cstheme="majorHAnsi"/>
           <w:color w:val="56616D"/>
-          <w:sz w:val="17"/>
-        </w:rPr>
-        <w:tab/>
+          <w:sz w:val="18"/>
+          <w:szCs w:val="28"/>
+        </w:rPr>
         <w:t>2012.08 - 2015.07</w:t>
       </w:r>
     </w:p>
     <w:p>
       <w:pPr>
-        <w:numPr>
-          <w:ilvl w:val="0"/>
-          <w:numId w:val="1"/>
-        </w:numPr>
-        <w:spacing w:line="312" w:lineRule="auto"/>
+        <w:pStyle w:val="ListBullet"/>
+        <w:spacing w:line="276" w:lineRule="auto"/>
+        <w:rPr>
+          <w:rFonts w:asciiTheme="majorHAnsi" w:hAnsiTheme="majorHAnsi" w:cstheme="majorHAnsi"/>
+          <w:sz w:val="20"/>
+          <w:szCs w:val="24"/>
+        </w:rPr>
       </w:pPr>
       <w:r>
-        <w:t>Designed integral helical gears for turbo compressors and performed core-system design and dynamic-system analysis.</w:t>
+        <w:rPr>
+          <w:rFonts w:asciiTheme="majorHAnsi" w:hAnsiTheme="majorHAnsi" w:cstheme="majorHAnsi"/>
+          <w:sz w:val="20"/>
+          <w:szCs w:val="24"/>
+        </w:rPr>
+        <w:t>Designed integral helical gears for turbo compressors and performed system dynamics analysis.</w:t>
       </w:r>
     </w:p>
     <w:p>
       <w:pPr>
-        <w:pStyle w:val="ResumeEntry"/>
+        <w:pStyle w:val="ListBullet"/>
+        <w:spacing w:line="276" w:lineRule="auto"/>
+        <w:rPr>
+          <w:rFonts w:asciiTheme="majorHAnsi" w:hAnsiTheme="majorHAnsi" w:cstheme="majorHAnsi"/>
+          <w:sz w:val="20"/>
+          <w:szCs w:val="24"/>
+        </w:rPr>
+      </w:pPr>
+      <w:r>
+        <w:rPr>
+          <w:rFonts w:asciiTheme="majorHAnsi" w:hAnsiTheme="majorHAnsi" w:cstheme="majorHAnsi"/>
+          <w:sz w:val="20"/>
+          <w:szCs w:val="24"/>
+        </w:rPr>
+        <w:t>Performed multibody dynamics analysis and vehicle stability assessment for vehicle-mounted remote weapon systems.</w:t>
+      </w:r>
+    </w:p>
+    <w:p>
+      <w:pPr>
+        <w:pStyle w:val="Heading2"/>
         <w:tabs>
-          <w:tab w:val="right" w:pos="10570"/>
+          <w:tab w:val="right" w:pos="10091"/>
         </w:tabs>
-        <w:spacing w:line="312" w:lineRule="auto"/>
+        <w:spacing w:line="276" w:lineRule="auto"/>
+        <w:rPr>
+          <w:rFonts w:cstheme="majorHAnsi"/>
+          <w:sz w:val="20"/>
+          <w:szCs w:val="28"/>
+        </w:rPr>
       </w:pPr>
       <w:r>
+        <w:rPr>
+          <w:rFonts w:cstheme="majorHAnsi"/>
+          <w:sz w:val="20"/>
+          <w:szCs w:val="28"/>
+        </w:rPr>
         <w:t>Engineering Intern | General Motors Korea</w:t>
       </w:r>
       <w:r>
         <w:rPr>
+          <w:rFonts w:cstheme="majorHAnsi"/>
+          <w:sz w:val="20"/>
+          <w:szCs w:val="28"/>
+        </w:rPr>
+        <w:tab/>
+      </w:r>
+      <w:r>
+        <w:rPr>
+          <w:rFonts w:cstheme="majorHAnsi"/>
           <w:color w:val="56616D"/>
-          <w:sz w:val="17"/>
-        </w:rPr>
-        <w:tab/>
+          <w:sz w:val="18"/>
+          <w:szCs w:val="28"/>
+        </w:rPr>
         <w:t>2011.07 - 2011.08</w:t>
       </w:r>
     </w:p>
     <w:p>
       <w:pPr>
-        <w:numPr>
-          <w:ilvl w:val="0"/>
-          <w:numId w:val="1"/>
-        </w:numPr>
-        <w:spacing w:line="312" w:lineRule="auto"/>
+        <w:pStyle w:val="ListBullet"/>
+        <w:spacing w:line="276" w:lineRule="auto"/>
+        <w:rPr>
+          <w:rFonts w:asciiTheme="majorHAnsi" w:hAnsiTheme="majorHAnsi" w:cstheme="majorHAnsi"/>
+          <w:sz w:val="20"/>
+          <w:szCs w:val="24"/>
+        </w:rPr>
       </w:pPr>
       <w:r>
+        <w:rPr>
+          <w:rFonts w:asciiTheme="majorHAnsi" w:hAnsiTheme="majorHAnsi" w:cstheme="majorHAnsi"/>
+          <w:sz w:val="20"/>
+          <w:szCs w:val="24"/>
+        </w:rPr>
         <w:t>Supported engine-map tuning and validation.</w:t>
       </w:r>
     </w:p>
     <w:p>
       <w:pPr>
-        <w:spacing w:line="312" w:lineRule="auto"/>
+        <w:pStyle w:val="Heading1"/>
+        <w:pageBreakBefore/>
+        <w:pBdr>
+          <w:bottom w:val="single" w:sz="6" w:space="4" w:color="5B5BD6"/>
+        </w:pBdr>
+        <w:spacing w:before="180" w:after="140" w:line="276" w:lineRule="auto"/>
+        <w:rPr>
+          <w:rFonts w:cstheme="majorHAnsi"/>
+          <w:sz w:val="24"/>
+          <w:szCs w:val="32"/>
+        </w:rPr>
       </w:pPr>
       <w:r>
-        <w:br w:type="page"/>
-      </w:r>
-    </w:p>
-    <w:p>
-      <w:pPr>
-        <w:pStyle w:val="ResumeSection"/>
-        <w:pBdr>
-          <w:bottom w:val="single" w:sz="6" w:space="3" w:color="5A8F00"/>
-        </w:pBdr>
-        <w:spacing w:line="312" w:lineRule="auto"/>
-      </w:pPr>
-      <w:r>
+        <w:rPr>
+          <w:rFonts w:cstheme="majorHAnsi"/>
+          <w:sz w:val="24"/>
+          <w:szCs w:val="32"/>
+        </w:rPr>
         <w:lastRenderedPageBreak/>
         <w:t>SELECTED PROJECTS</w:t>
       </w:r>
     </w:p>
     <w:p>
       <w:pPr>
-        <w:pStyle w:val="ResumeEntry"/>
-        <w:tabs>
-          <w:tab w:val="right" w:pos="10570"/>
-        </w:tabs>
-        <w:spacing w:line="312" w:lineRule="auto"/>
+        <w:pStyle w:val="Heading2"/>
+        <w:spacing w:line="276" w:lineRule="auto"/>
+        <w:rPr>
+          <w:rFonts w:cstheme="majorHAnsi"/>
+          <w:sz w:val="20"/>
+          <w:szCs w:val="28"/>
+        </w:rPr>
       </w:pPr>
       <w:r>
-        <w:t>Trailer Parking Assist &amp; Minimum Risk Maneuver | HL Mando</w:t>
-      </w:r>
-      <w:r>
-        <w:rPr>
-          <w:color w:val="56616D"/>
-          <w:sz w:val="17"/>
-        </w:rPr>
-        <w:tab/>
-        <w:t>2026 - Present</w:t>
+        <w:rPr>
+          <w:rFonts w:cstheme="majorHAnsi"/>
+          <w:sz w:val="20"/>
+          <w:szCs w:val="28"/>
+        </w:rPr>
+        <w:t>Vehicle Stability Control Assist (VSCA) | HL Mando</w:t>
       </w:r>
     </w:p>
     <w:p>
       <w:pPr>
-        <w:numPr>
-          <w:ilvl w:val="0"/>
-          <w:numId w:val="1"/>
-        </w:numPr>
-        <w:spacing w:line="312" w:lineRule="auto"/>
+        <w:pStyle w:val="ListBullet"/>
+        <w:spacing w:line="276" w:lineRule="auto"/>
+        <w:rPr>
+          <w:rFonts w:asciiTheme="majorHAnsi" w:hAnsiTheme="majorHAnsi" w:cstheme="majorHAnsi"/>
+          <w:sz w:val="20"/>
+          <w:szCs w:val="24"/>
+        </w:rPr>
       </w:pPr>
       <w:r>
-        <w:t>Technical lead and project owner for planning and control architecture, simulation, real-time implementation, system integration, and vehicle-level evaluation.</w:t>
+        <w:rPr>
+          <w:rFonts w:asciiTheme="majorHAnsi" w:hAnsiTheme="majorHAnsi" w:cstheme="majorHAnsi"/>
+          <w:sz w:val="20"/>
+          <w:szCs w:val="24"/>
+        </w:rPr>
+        <w:t>Developed integrated control of differential braking and semi-active suspension to address the trade-off between lateral stability and roll response during severe lane-change maneuvers.</w:t>
       </w:r>
     </w:p>
     <w:p>
       <w:pPr>
-        <w:numPr>
-          <w:ilvl w:val="0"/>
-          <w:numId w:val="1"/>
-        </w:numPr>
-        <w:spacing w:line="312" w:lineRule="auto"/>
+        <w:pStyle w:val="ListBullet"/>
+        <w:spacing w:line="276" w:lineRule="auto"/>
+        <w:rPr>
+          <w:rFonts w:asciiTheme="majorHAnsi" w:hAnsiTheme="majorHAnsi" w:cstheme="majorHAnsi"/>
+          <w:sz w:val="20"/>
+          <w:szCs w:val="24"/>
+        </w:rPr>
       </w:pPr>
       <w:r>
-        <w:t>Developing robust maneuver generation and safe fallback behavior for production-oriented automated-driving functions.</w:t>
+        <w:rPr>
+          <w:rFonts w:asciiTheme="majorHAnsi" w:hAnsiTheme="majorHAnsi" w:cstheme="majorHAnsi"/>
+          <w:sz w:val="20"/>
+          <w:szCs w:val="24"/>
+        </w:rPr>
+        <w:t>Applied sliding-mode observers to estimate sideslip and roll states.</w:t>
       </w:r>
     </w:p>
     <w:p>
       <w:pPr>
-        <w:pStyle w:val="ResumeEntry"/>
-        <w:tabs>
-          <w:tab w:val="right" w:pos="10570"/>
-        </w:tabs>
-        <w:spacing w:line="312" w:lineRule="auto"/>
+        <w:pStyle w:val="ListBullet"/>
+        <w:spacing w:line="276" w:lineRule="auto"/>
+        <w:rPr>
+          <w:rFonts w:asciiTheme="majorHAnsi" w:hAnsiTheme="majorHAnsi" w:cstheme="majorHAnsi"/>
+          <w:sz w:val="20"/>
+          <w:szCs w:val="24"/>
+        </w:rPr>
       </w:pPr>
       <w:r>
-        <w:t>Smart Hitching Assist | HL Mando</w:t>
-      </w:r>
-      <w:r>
-        <w:rPr>
-          <w:color w:val="56616D"/>
-          <w:sz w:val="17"/>
-        </w:rPr>
-        <w:tab/>
-        <w:t>2025</w:t>
+        <w:rPr>
+          <w:rFonts w:asciiTheme="majorHAnsi" w:hAnsiTheme="majorHAnsi" w:cstheme="majorHAnsi"/>
+          <w:sz w:val="20"/>
+          <w:szCs w:val="24"/>
+        </w:rPr>
+        <w:t>Used sliding-mode control to compute target moments and optimal control allocation to distribute wheel brake torques and suspension damping. Coordinated lateral and roll behavior through roll-region-index-based damping allocation.</w:t>
       </w:r>
     </w:p>
     <w:p>
       <w:pPr>
-        <w:numPr>
-          <w:ilvl w:val="0"/>
-          <w:numId w:val="1"/>
-        </w:numPr>
-        <w:spacing w:line="312" w:lineRule="auto"/>
+        <w:pStyle w:val="ListBullet"/>
+        <w:spacing w:line="276" w:lineRule="auto"/>
+        <w:rPr>
+          <w:rFonts w:asciiTheme="majorHAnsi" w:hAnsiTheme="majorHAnsi" w:cstheme="majorHAnsi"/>
+          <w:sz w:val="20"/>
+          <w:szCs w:val="24"/>
+        </w:rPr>
       </w:pPr>
       <w:r>
-        <w:t>Led end-to-end function architecture, planning and control development, real-time deployment, vehicle integration, calibration, and validation.</w:t>
+        <w:rPr>
+          <w:rFonts w:asciiTheme="majorHAnsi" w:hAnsiTheme="majorHAnsi" w:cstheme="majorHAnsi"/>
+          <w:sz w:val="20"/>
+          <w:szCs w:val="24"/>
+        </w:rPr>
+        <w:t>Implemented and evaluated the controller through simulation and vehicle testing using MATLAB/Simulink, CarSim, and dSPACE MicroAutoBox II.</w:t>
       </w:r>
     </w:p>
     <w:p>
       <w:pPr>
-        <w:numPr>
-          <w:ilvl w:val="0"/>
-          <w:numId w:val="1"/>
-        </w:numPr>
-        <w:spacing w:line="312" w:lineRule="auto"/>
+        <w:pStyle w:val="Heading2"/>
+        <w:spacing w:line="276" w:lineRule="auto"/>
+        <w:rPr>
+          <w:rFonts w:cstheme="majorHAnsi"/>
+          <w:sz w:val="20"/>
+          <w:szCs w:val="28"/>
+        </w:rPr>
       </w:pPr>
       <w:r>
-        <w:t>Delivered a successful customer demonstration; received a Company Special Recognition Award in December 2025.</w:t>
+        <w:rPr>
+          <w:rFonts w:cstheme="majorHAnsi"/>
+          <w:sz w:val="20"/>
+          <w:szCs w:val="28"/>
+        </w:rPr>
+        <w:t>Evasive Collision Avoidance (ECA) | HL Mando</w:t>
       </w:r>
     </w:p>
     <w:p>
       <w:pPr>
-        <w:pStyle w:val="ResumeEntry"/>
-        <w:tabs>
-          <w:tab w:val="right" w:pos="10570"/>
-        </w:tabs>
-        <w:spacing w:line="312" w:lineRule="auto"/>
+        <w:pStyle w:val="ListBullet"/>
+        <w:spacing w:line="276" w:lineRule="auto"/>
+        <w:rPr>
+          <w:rFonts w:asciiTheme="majorHAnsi" w:hAnsiTheme="majorHAnsi" w:cstheme="majorHAnsi"/>
+          <w:sz w:val="20"/>
+          <w:szCs w:val="24"/>
+        </w:rPr>
       </w:pPr>
       <w:r>
-        <w:t>Evasive Collision Avoidance | HL Mando</w:t>
-      </w:r>
-      <w:r>
-        <w:rPr>
-          <w:color w:val="56616D"/>
-          <w:sz w:val="17"/>
-        </w:rPr>
-        <w:tab/>
-        <w:t>2024</w:t>
+        <w:rPr>
+          <w:rFonts w:asciiTheme="majorHAnsi" w:hAnsiTheme="majorHAnsi" w:cstheme="majorHAnsi"/>
+          <w:sz w:val="20"/>
+          <w:szCs w:val="24"/>
+        </w:rPr>
+        <w:t>Developed evasive path generation and coordinated braking, rear-wheel steering, and front-steering assistance for path tracking and vehicle stabilization around obstacles ahead.</w:t>
       </w:r>
     </w:p>
     <w:p>
       <w:pPr>
-        <w:numPr>
-          <w:ilvl w:val="0"/>
-          <w:numId w:val="1"/>
-        </w:numPr>
-        <w:spacing w:line="312" w:lineRule="auto"/>
+        <w:pStyle w:val="ListBullet"/>
+        <w:spacing w:line="276" w:lineRule="auto"/>
+        <w:rPr>
+          <w:rFonts w:asciiTheme="majorHAnsi" w:hAnsiTheme="majorHAnsi" w:cstheme="majorHAnsi"/>
+          <w:sz w:val="20"/>
+          <w:szCs w:val="24"/>
+        </w:rPr>
       </w:pPr>
       <w:r>
-        <w:t>Owned the complete planning and control scope: evasive path generation, path tracking control, and vehicle stability coordination.</w:t>
+        <w:rPr>
+          <w:rFonts w:asciiTheme="majorHAnsi" w:hAnsiTheme="majorHAnsi" w:cstheme="majorHAnsi"/>
+          <w:sz w:val="20"/>
+          <w:szCs w:val="24"/>
+        </w:rPr>
+        <w:t>Applied MPC-based integrated chassis control to combine path planning, tracking, and vehicle stabilization.</w:t>
       </w:r>
     </w:p>
     <w:p>
       <w:pPr>
-        <w:numPr>
-          <w:ilvl w:val="0"/>
-          <w:numId w:val="1"/>
-        </w:numPr>
-        <w:spacing w:line="312" w:lineRule="auto"/>
+        <w:pStyle w:val="ListBullet"/>
+        <w:spacing w:line="276" w:lineRule="auto"/>
+        <w:rPr>
+          <w:rFonts w:asciiTheme="majorHAnsi" w:hAnsiTheme="majorHAnsi" w:cstheme="majorHAnsi"/>
+          <w:sz w:val="20"/>
+          <w:szCs w:val="24"/>
+        </w:rPr>
       </w:pPr>
       <w:r>
-        <w:t>Integrated and validated the unified framework through simulation, dSPACE real-time execution, in-vehicle tuning, and safety-critical scenario testing.</w:t>
+        <w:rPr>
+          <w:rFonts w:asciiTheme="majorHAnsi" w:hAnsiTheme="majorHAnsi" w:cstheme="majorHAnsi"/>
+          <w:sz w:val="20"/>
+          <w:szCs w:val="24"/>
+        </w:rPr>
+        <w:t>Implemented and evaluated the controller through simulation and vehicle testing using MATLAB/Simulink, CarSim, and dSPACE MicroAutoBox II.</w:t>
       </w:r>
     </w:p>
     <w:p>
       <w:pPr>
-        <w:pStyle w:val="ResumeEntry"/>
-        <w:tabs>
-          <w:tab w:val="right" w:pos="10570"/>
-        </w:tabs>
-        <w:spacing w:line="312" w:lineRule="auto"/>
+        <w:pStyle w:val="Heading2"/>
+        <w:spacing w:line="276" w:lineRule="auto"/>
+        <w:rPr>
+          <w:rFonts w:cstheme="majorHAnsi"/>
+          <w:sz w:val="20"/>
+          <w:szCs w:val="28"/>
+        </w:rPr>
       </w:pPr>
       <w:r>
-        <w:t>Vehicle Stability Control Assist | HL Mando</w:t>
-      </w:r>
-      <w:r>
-        <w:rPr>
-          <w:color w:val="56616D"/>
-          <w:sz w:val="17"/>
-        </w:rPr>
-        <w:tab/>
-        <w:t>2024</w:t>
+        <w:rPr>
+          <w:rFonts w:cstheme="majorHAnsi"/>
+          <w:sz w:val="20"/>
+          <w:szCs w:val="28"/>
+        </w:rPr>
+        <w:t>Smart Hitching Assist (SHA) | HL Mando</w:t>
       </w:r>
     </w:p>
     <w:p>
       <w:pPr>
-        <w:numPr>
-          <w:ilvl w:val="0"/>
-          <w:numId w:val="1"/>
-        </w:numPr>
-        <w:spacing w:line="312" w:lineRule="auto"/>
+        <w:pStyle w:val="ListBullet"/>
+        <w:spacing w:line="276" w:lineRule="auto"/>
+        <w:rPr>
+          <w:rFonts w:asciiTheme="majorHAnsi" w:hAnsiTheme="majorHAnsi" w:cstheme="majorHAnsi"/>
+          <w:sz w:val="20"/>
+          <w:szCs w:val="24"/>
+        </w:rPr>
       </w:pPr>
       <w:r>
-        <w:t>Developed a hierarchical integrated chassis controller combining differential braking and semi-active suspension damping.</w:t>
+        <w:rPr>
+          <w:rFonts w:asciiTheme="majorHAnsi" w:hAnsiTheme="majorHAnsi" w:cstheme="majorHAnsi"/>
+          <w:sz w:val="20"/>
+          <w:szCs w:val="24"/>
+        </w:rPr>
+        <w:t>Developed low-speed automated driving for precise trailer hitch alignment using camera-based target-pose estimates.</w:t>
       </w:r>
     </w:p>
     <w:p>
       <w:pPr>
-        <w:numPr>
-          <w:ilvl w:val="0"/>
-          <w:numId w:val="1"/>
-        </w:numPr>
-        <w:spacing w:line="312" w:lineRule="auto"/>
+        <w:pStyle w:val="ListBullet"/>
+        <w:spacing w:line="276" w:lineRule="auto"/>
+        <w:rPr>
+          <w:rFonts w:asciiTheme="majorHAnsi" w:hAnsiTheme="majorHAnsi" w:cstheme="majorHAnsi"/>
+          <w:sz w:val="20"/>
+          <w:szCs w:val="24"/>
+        </w:rPr>
       </w:pPr>
       <w:r>
-        <w:t>Published simulation and real-world evaluation results showing approximately 17.4% lower maximum roll angle and 8.7% lower maximum sideslip angle versus respective conventional methods.</w:t>
+        <w:rPr>
+          <w:rFonts w:asciiTheme="majorHAnsi" w:hAnsiTheme="majorHAnsi" w:cstheme="majorHAnsi"/>
+          <w:sz w:val="20"/>
+          <w:szCs w:val="24"/>
+        </w:rPr>
+        <w:t>Developed real-time obstacle avoidance and continuous-curvature path generation using Bézier curves.</w:t>
       </w:r>
     </w:p>
     <w:p>
       <w:pPr>
-        <w:pStyle w:val="ResumeSection"/>
+        <w:pStyle w:val="ListBullet"/>
+        <w:spacing w:line="276" w:lineRule="auto"/>
+        <w:rPr>
+          <w:rFonts w:asciiTheme="majorHAnsi" w:hAnsiTheme="majorHAnsi" w:cstheme="majorHAnsi"/>
+          <w:sz w:val="20"/>
+          <w:szCs w:val="24"/>
+        </w:rPr>
+      </w:pPr>
+      <w:r>
+        <w:rPr>
+          <w:rFonts w:asciiTheme="majorHAnsi" w:hAnsiTheme="majorHAnsi" w:cstheme="majorHAnsi"/>
+          <w:sz w:val="20"/>
+          <w:szCs w:val="24"/>
+        </w:rPr>
+        <w:t>Applied Lyapunov-informed MPPI for lateral alignment and speed-feedback control for longitudinal motion.</w:t>
+      </w:r>
+    </w:p>
+    <w:p>
+      <w:pPr>
+        <w:pStyle w:val="ListBullet"/>
+        <w:spacing w:line="276" w:lineRule="auto"/>
+        <w:rPr>
+          <w:rFonts w:asciiTheme="majorHAnsi" w:hAnsiTheme="majorHAnsi" w:cstheme="majorHAnsi"/>
+          <w:sz w:val="20"/>
+          <w:szCs w:val="24"/>
+        </w:rPr>
+      </w:pPr>
+      <w:r>
+        <w:rPr>
+          <w:rFonts w:asciiTheme="majorHAnsi" w:hAnsiTheme="majorHAnsi" w:cstheme="majorHAnsi"/>
+          <w:sz w:val="20"/>
+          <w:szCs w:val="24"/>
+        </w:rPr>
+        <w:t>Performed real-time implementation, tuning, and vehicle evaluation using MATLAB/Simulink and dSPACE MicroAutoBox II.</w:t>
+      </w:r>
+    </w:p>
+    <w:p>
+      <w:pPr>
+        <w:pStyle w:val="ListBullet"/>
+        <w:spacing w:line="276" w:lineRule="auto"/>
+        <w:rPr>
+          <w:rFonts w:asciiTheme="majorHAnsi" w:hAnsiTheme="majorHAnsi" w:cstheme="majorHAnsi"/>
+          <w:sz w:val="20"/>
+          <w:szCs w:val="24"/>
+        </w:rPr>
+      </w:pPr>
+      <w:r>
+        <w:rPr>
+          <w:rFonts w:asciiTheme="majorHAnsi" w:hAnsiTheme="majorHAnsi" w:cstheme="majorHAnsi"/>
+          <w:sz w:val="20"/>
+          <w:szCs w:val="24"/>
+        </w:rPr>
+        <w:t>Completed a customer demonstration and received a Company Special Recognition Award.</w:t>
+      </w:r>
+    </w:p>
+    <w:p>
+      <w:pPr>
+        <w:pStyle w:val="Heading2"/>
+        <w:spacing w:line="276" w:lineRule="auto"/>
+        <w:rPr>
+          <w:rFonts w:cstheme="majorHAnsi"/>
+          <w:sz w:val="20"/>
+          <w:szCs w:val="28"/>
+        </w:rPr>
+      </w:pPr>
+      <w:r>
+        <w:rPr>
+          <w:rFonts w:cstheme="majorHAnsi"/>
+          <w:sz w:val="20"/>
+          <w:szCs w:val="28"/>
+        </w:rPr>
+        <w:t>Trailer Parking Assist (TPA) | HL Mando</w:t>
+      </w:r>
+    </w:p>
+    <w:p>
+      <w:pPr>
+        <w:pStyle w:val="ListBullet"/>
+        <w:spacing w:line="276" w:lineRule="auto"/>
+        <w:rPr>
+          <w:rFonts w:asciiTheme="majorHAnsi" w:hAnsiTheme="majorHAnsi" w:cstheme="majorHAnsi"/>
+          <w:sz w:val="20"/>
+          <w:szCs w:val="24"/>
+        </w:rPr>
+      </w:pPr>
+      <w:r>
+        <w:rPr>
+          <w:rFonts w:asciiTheme="majorHAnsi" w:hAnsiTheme="majorHAnsi" w:cstheme="majorHAnsi"/>
+          <w:sz w:val="20"/>
+          <w:szCs w:val="24"/>
+        </w:rPr>
+        <w:t>Developed path planning and tracking control for forward and reverse parking maneuvers of a vehicle-trailer combination.</w:t>
+      </w:r>
+    </w:p>
+    <w:p>
+      <w:pPr>
+        <w:pStyle w:val="ListBullet"/>
+        <w:spacing w:line="276" w:lineRule="auto"/>
+        <w:rPr>
+          <w:rFonts w:asciiTheme="majorHAnsi" w:hAnsiTheme="majorHAnsi" w:cstheme="majorHAnsi"/>
+          <w:sz w:val="20"/>
+          <w:szCs w:val="24"/>
+        </w:rPr>
+      </w:pPr>
+      <w:r>
+        <w:rPr>
+          <w:rFonts w:asciiTheme="majorHAnsi" w:hAnsiTheme="majorHAnsi" w:cstheme="majorHAnsi"/>
+          <w:sz w:val="20"/>
+          <w:szCs w:val="24"/>
+        </w:rPr>
+        <w:t>Applied sampling-based optimal control incorporating constraints to address jackknife risk.</w:t>
+      </w:r>
+    </w:p>
+    <w:p>
+      <w:pPr>
+        <w:pStyle w:val="ListBullet"/>
+        <w:spacing w:line="276" w:lineRule="auto"/>
+        <w:rPr>
+          <w:rFonts w:asciiTheme="majorHAnsi" w:hAnsiTheme="majorHAnsi" w:cstheme="majorHAnsi"/>
+          <w:sz w:val="20"/>
+          <w:szCs w:val="24"/>
+        </w:rPr>
+      </w:pPr>
+      <w:r>
+        <w:rPr>
+          <w:rFonts w:asciiTheme="majorHAnsi" w:hAnsiTheme="majorHAnsi" w:cstheme="majorHAnsi"/>
+          <w:sz w:val="20"/>
+          <w:szCs w:val="24"/>
+        </w:rPr>
+        <w:t>Performed real-time implementation, tuning, and vehicle evaluation using MATLAB/Simulink and dSPACE MicroAutoBox II.</w:t>
+      </w:r>
+    </w:p>
+    <w:p>
+      <w:pPr>
+        <w:pStyle w:val="Heading2"/>
+        <w:spacing w:line="276" w:lineRule="auto"/>
+        <w:rPr>
+          <w:rFonts w:cstheme="majorHAnsi"/>
+          <w:sz w:val="20"/>
+          <w:szCs w:val="28"/>
+        </w:rPr>
+      </w:pPr>
+      <w:r>
+        <w:rPr>
+          <w:rFonts w:cstheme="majorHAnsi"/>
+          <w:sz w:val="20"/>
+          <w:szCs w:val="28"/>
+        </w:rPr>
+        <w:t>Integrated Chassis Control for Path Tracking and Vehicle Stability | HL Mando</w:t>
+      </w:r>
+    </w:p>
+    <w:p>
+      <w:pPr>
+        <w:pStyle w:val="ListBullet"/>
+        <w:spacing w:line="276" w:lineRule="auto"/>
+        <w:rPr>
+          <w:rFonts w:asciiTheme="majorHAnsi" w:hAnsiTheme="majorHAnsi" w:cstheme="majorHAnsi"/>
+          <w:sz w:val="20"/>
+          <w:szCs w:val="24"/>
+        </w:rPr>
+      </w:pPr>
+      <w:r>
+        <w:rPr>
+          <w:rFonts w:asciiTheme="majorHAnsi" w:hAnsiTheme="majorHAnsi" w:cstheme="majorHAnsi"/>
+          <w:sz w:val="20"/>
+          <w:szCs w:val="24"/>
+        </w:rPr>
+        <w:t>Developing an optimal control architecture that coordinates steering, braking, and suspension while jointly considering tracking error and vehicle stability metrics.</w:t>
+      </w:r>
+    </w:p>
+    <w:p>
+      <w:pPr>
+        <w:pStyle w:val="ListBullet"/>
+        <w:spacing w:line="276" w:lineRule="auto"/>
+        <w:rPr>
+          <w:rFonts w:asciiTheme="majorHAnsi" w:hAnsiTheme="majorHAnsi" w:cstheme="majorHAnsi"/>
+          <w:sz w:val="20"/>
+          <w:szCs w:val="24"/>
+        </w:rPr>
+      </w:pPr>
+      <w:r>
+        <w:rPr>
+          <w:rFonts w:asciiTheme="majorHAnsi" w:hAnsiTheme="majorHAnsi" w:cstheme="majorHAnsi"/>
+          <w:sz w:val="20"/>
+          <w:szCs w:val="24"/>
+        </w:rPr>
+        <w:t>Developed sampling-based MHE to improve longitudinal and lateral velocity estimation under challenging driving conditions, and evaluated it using recorded vehicle data.</w:t>
+      </w:r>
+    </w:p>
+    <w:p>
+      <w:pPr>
+        <w:pStyle w:val="ListBullet"/>
+        <w:spacing w:line="276" w:lineRule="auto"/>
+        <w:rPr>
+          <w:rFonts w:asciiTheme="majorHAnsi" w:hAnsiTheme="majorHAnsi" w:cstheme="majorHAnsi"/>
+          <w:sz w:val="20"/>
+          <w:szCs w:val="24"/>
+        </w:rPr>
+      </w:pPr>
+      <w:r>
+        <w:rPr>
+          <w:rFonts w:asciiTheme="majorHAnsi" w:hAnsiTheme="majorHAnsi" w:cstheme="majorHAnsi"/>
+          <w:sz w:val="20"/>
+          <w:szCs w:val="24"/>
+        </w:rPr>
+        <w:t>Designed an MPPI-based control architecture for integrated path tracking and vehicle stabilization.</w:t>
+      </w:r>
+    </w:p>
+    <w:p>
+      <w:pPr>
+        <w:pStyle w:val="ListBullet"/>
+        <w:spacing w:line="276" w:lineRule="auto"/>
+        <w:rPr>
+          <w:rFonts w:asciiTheme="majorHAnsi" w:hAnsiTheme="majorHAnsi" w:cstheme="majorHAnsi"/>
+          <w:sz w:val="20"/>
+          <w:szCs w:val="24"/>
+        </w:rPr>
+      </w:pPr>
+      <w:r>
+        <w:rPr>
+          <w:rFonts w:asciiTheme="majorHAnsi" w:hAnsiTheme="majorHAnsi" w:cstheme="majorHAnsi"/>
+          <w:sz w:val="20"/>
+          <w:szCs w:val="24"/>
+        </w:rPr>
+        <w:t>Developed a software-in-the-loop simulation (SiLS) environment using MATLAB/Simulink, CarSim, and CARLA, and an NVIDIA Jetson AGX-based rapid control prototyping (RCP) environment for state-estimation and control-module integration.</w:t>
+      </w:r>
+    </w:p>
+    <w:p>
+      <w:pPr>
+        <w:pStyle w:val="Heading1"/>
+        <w:pageBreakBefore/>
         <w:pBdr>
-          <w:bottom w:val="single" w:sz="6" w:space="3" w:color="5A8F00"/>
+          <w:bottom w:val="single" w:sz="6" w:space="4" w:color="5B5BD6"/>
         </w:pBdr>
-        <w:spacing w:line="312" w:lineRule="auto"/>
+        <w:spacing w:before="180" w:after="140" w:line="276" w:lineRule="auto"/>
+        <w:rPr>
+          <w:rFonts w:cstheme="majorHAnsi"/>
+          <w:sz w:val="24"/>
+          <w:szCs w:val="32"/>
+        </w:rPr>
       </w:pPr>
       <w:r>
+        <w:rPr>
+          <w:rFonts w:cstheme="majorHAnsi"/>
+          <w:sz w:val="24"/>
+          <w:szCs w:val="32"/>
+        </w:rPr>
+        <w:lastRenderedPageBreak/>
         <w:t>EDUCATION</w:t>
       </w:r>
     </w:p>
     <w:p>
       <w:pPr>
-        <w:pStyle w:val="ResumeEntry"/>
+        <w:pStyle w:val="Heading2"/>
         <w:tabs>
-          <w:tab w:val="right" w:pos="10570"/>
+          <w:tab w:val="right" w:pos="10091"/>
         </w:tabs>
-        <w:spacing w:line="312" w:lineRule="auto"/>
+        <w:spacing w:line="276" w:lineRule="auto"/>
+        <w:rPr>
+          <w:rFonts w:cstheme="majorHAnsi"/>
+          <w:sz w:val="20"/>
+          <w:szCs w:val="28"/>
+        </w:rPr>
       </w:pPr>
       <w:r>
-        <w:t>Ph.D. Candidate, Mechanical Engineering | Seoul National University</w:t>
+        <w:rPr>
+          <w:rFonts w:cstheme="majorHAnsi"/>
+          <w:sz w:val="20"/>
+          <w:szCs w:val="28"/>
+        </w:rPr>
+        <w:t>Ph.D. in Mechanical Engineering (In Progress) | Seoul National University</w:t>
       </w:r>
       <w:r>
         <w:rPr>
+          <w:rFonts w:cstheme="majorHAnsi"/>
+          <w:sz w:val="20"/>
+          <w:szCs w:val="28"/>
+        </w:rPr>
+        <w:tab/>
+      </w:r>
+      <w:r>
+        <w:rPr>
+          <w:rFonts w:cstheme="majorHAnsi"/>
           <w:color w:val="56616D"/>
-          <w:sz w:val="17"/>
-        </w:rPr>
-        <w:tab/>
+          <w:sz w:val="18"/>
+          <w:szCs w:val="28"/>
+        </w:rPr>
         <w:t>2023.03 - Present</w:t>
       </w:r>
     </w:p>
     <w:p>
       <w:pPr>
-        <w:pStyle w:val="ResumeSmall"/>
-        <w:spacing w:line="312" w:lineRule="auto"/>
+        <w:spacing w:line="276" w:lineRule="auto"/>
+        <w:rPr>
+          <w:rFonts w:asciiTheme="majorHAnsi" w:hAnsiTheme="majorHAnsi" w:cstheme="majorHAnsi"/>
+          <w:sz w:val="20"/>
+          <w:szCs w:val="24"/>
+        </w:rPr>
       </w:pPr>
       <w:r>
+        <w:rPr>
+          <w:rFonts w:asciiTheme="majorHAnsi" w:hAnsiTheme="majorHAnsi" w:cstheme="majorHAnsi"/>
+          <w:sz w:val="20"/>
+          <w:szCs w:val="24"/>
+        </w:rPr>
         <w:t>Interactive and Networked Robotics Laboratory (INRoL), Advisor: Professor Dongjun Lee</w:t>
       </w:r>
     </w:p>
     <w:p>
       <w:pPr>
-        <w:pStyle w:val="ResumeSmall"/>
-        <w:spacing w:line="312" w:lineRule="auto"/>
+        <w:spacing w:line="276" w:lineRule="auto"/>
+        <w:rPr>
+          <w:rFonts w:asciiTheme="majorHAnsi" w:hAnsiTheme="majorHAnsi" w:cstheme="majorHAnsi"/>
+          <w:sz w:val="20"/>
+          <w:szCs w:val="24"/>
+        </w:rPr>
       </w:pPr>
       <w:r>
-        <w:t>Research: Supervisory Integrated Chassis Control Using Model Predictive Path Integral Control with Legacy Controllers</w:t>
+        <w:rPr>
+          <w:rFonts w:asciiTheme="majorHAnsi" w:hAnsiTheme="majorHAnsi" w:cstheme="majorHAnsi"/>
+          <w:sz w:val="20"/>
+          <w:szCs w:val="24"/>
+        </w:rPr>
+        <w:t>Research focus: Supervisory vehicle control over legacy controllers</w:t>
       </w:r>
     </w:p>
     <w:p>
       <w:pPr>
-        <w:pStyle w:val="ResumeEntry"/>
+        <w:pStyle w:val="Heading2"/>
         <w:tabs>
-          <w:tab w:val="right" w:pos="10570"/>
+          <w:tab w:val="right" w:pos="10091"/>
         </w:tabs>
-        <w:spacing w:line="312" w:lineRule="auto"/>
+        <w:spacing w:line="276" w:lineRule="auto"/>
+        <w:rPr>
+          <w:rFonts w:cstheme="majorHAnsi"/>
+          <w:sz w:val="20"/>
+          <w:szCs w:val="28"/>
+        </w:rPr>
       </w:pPr>
       <w:r>
-        <w:t>M.S., Mechanical Engineering | Seoul National University</w:t>
+        <w:rPr>
+          <w:rFonts w:cstheme="majorHAnsi"/>
+          <w:sz w:val="20"/>
+          <w:szCs w:val="28"/>
+        </w:rPr>
+        <w:t>M.S. in Mechanical Engineering | Seoul National University</w:t>
       </w:r>
       <w:r>
         <w:rPr>
+          <w:rFonts w:cstheme="majorHAnsi"/>
+          <w:sz w:val="20"/>
+          <w:szCs w:val="28"/>
+        </w:rPr>
+        <w:tab/>
+      </w:r>
+      <w:r>
+        <w:rPr>
+          <w:rFonts w:cstheme="majorHAnsi"/>
           <w:color w:val="56616D"/>
-          <w:sz w:val="17"/>
-        </w:rPr>
-        <w:tab/>
+          <w:sz w:val="18"/>
+          <w:szCs w:val="28"/>
+        </w:rPr>
         <w:t>2020.09 - 2022.06</w:t>
       </w:r>
     </w:p>
     <w:p>
       <w:pPr>
-        <w:pStyle w:val="ResumeSmall"/>
-        <w:spacing w:line="312" w:lineRule="auto"/>
+        <w:spacing w:line="276" w:lineRule="auto"/>
+        <w:rPr>
+          <w:rFonts w:asciiTheme="majorHAnsi" w:hAnsiTheme="majorHAnsi" w:cstheme="majorHAnsi"/>
+          <w:sz w:val="20"/>
+          <w:szCs w:val="24"/>
+        </w:rPr>
       </w:pPr>
       <w:r>
+        <w:rPr>
+          <w:rFonts w:asciiTheme="majorHAnsi" w:hAnsiTheme="majorHAnsi" w:cstheme="majorHAnsi"/>
+          <w:sz w:val="20"/>
+          <w:szCs w:val="24"/>
+        </w:rPr>
         <w:t>Vehicle Dynamics and Control Laboratory (VDCL), Advisor: Professor Kyongsu Yi</w:t>
       </w:r>
     </w:p>
     <w:p>
       <w:pPr>
-        <w:pStyle w:val="ResumeSmall"/>
-        <w:spacing w:line="312" w:lineRule="auto"/>
+        <w:spacing w:line="276" w:lineRule="auto"/>
+        <w:rPr>
+          <w:rFonts w:asciiTheme="majorHAnsi" w:hAnsiTheme="majorHAnsi" w:cstheme="majorHAnsi"/>
+          <w:sz w:val="20"/>
+          <w:szCs w:val="24"/>
+        </w:rPr>
       </w:pPr>
       <w:r>
+        <w:rPr>
+          <w:rFonts w:asciiTheme="majorHAnsi" w:hAnsiTheme="majorHAnsi" w:cstheme="majorHAnsi"/>
+          <w:sz w:val="20"/>
+          <w:szCs w:val="24"/>
+        </w:rPr>
         <w:t>Thesis: Path Tracking Control of Four-Wheel-Independent-Steering-and-Driving Vehicle Based on Adaptive-Weight Optimal Control</w:t>
       </w:r>
     </w:p>
     <w:p>
       <w:pPr>
-        <w:pStyle w:val="ResumeEntry"/>
+        <w:pStyle w:val="Heading2"/>
         <w:tabs>
-          <w:tab w:val="right" w:pos="10570"/>
+          <w:tab w:val="right" w:pos="10091"/>
         </w:tabs>
-        <w:spacing w:line="312" w:lineRule="auto"/>
+        <w:spacing w:line="276" w:lineRule="auto"/>
+        <w:rPr>
+          <w:rFonts w:cstheme="majorHAnsi"/>
+          <w:sz w:val="20"/>
+          <w:szCs w:val="28"/>
+        </w:rPr>
       </w:pPr>
       <w:r>
-        <w:t>B.S., Mechanical Engineering | Ajou University</w:t>
+        <w:rPr>
+          <w:rFonts w:cstheme="majorHAnsi"/>
+          <w:sz w:val="20"/>
+          <w:szCs w:val="28"/>
+        </w:rPr>
+        <w:t>B.S. in Mechanical Engineering | Ajou University</w:t>
       </w:r>
       <w:r>
         <w:rPr>
+          <w:rFonts w:cstheme="majorHAnsi"/>
+          <w:sz w:val="20"/>
+          <w:szCs w:val="28"/>
+        </w:rPr>
+        <w:tab/>
+      </w:r>
+      <w:r>
+        <w:rPr>
+          <w:rFonts w:cstheme="majorHAnsi"/>
           <w:color w:val="56616D"/>
-          <w:sz w:val="17"/>
-        </w:rPr>
-        <w:tab/>
+          <w:sz w:val="18"/>
+          <w:szCs w:val="28"/>
+        </w:rPr>
         <w:t>2006.03 - 2012.06</w:t>
       </w:r>
     </w:p>
     <w:p>
       <w:pPr>
-        <w:pStyle w:val="ResumeSection"/>
+        <w:pStyle w:val="Heading1"/>
         <w:pBdr>
-          <w:bottom w:val="single" w:sz="6" w:space="3" w:color="5A8F00"/>
+          <w:bottom w:val="single" w:sz="6" w:space="4" w:color="5B5BD6"/>
         </w:pBdr>
-        <w:spacing w:line="312" w:lineRule="auto"/>
+        <w:spacing w:before="180" w:after="140" w:line="276" w:lineRule="auto"/>
+        <w:rPr>
+          <w:rFonts w:cstheme="majorHAnsi"/>
+          <w:sz w:val="24"/>
+          <w:szCs w:val="32"/>
+        </w:rPr>
       </w:pPr>
       <w:r>
+        <w:rPr>
+          <w:rFonts w:cstheme="majorHAnsi"/>
+          <w:sz w:val="24"/>
+          <w:szCs w:val="32"/>
+        </w:rPr>
         <w:t>SELECTED HONORS</w:t>
       </w:r>
     </w:p>
     <w:p>
       <w:pPr>
-        <w:pStyle w:val="ResumeSmall"/>
-        <w:numPr>
-          <w:ilvl w:val="0"/>
-          <w:numId w:val="1"/>
-        </w:numPr>
-        <w:spacing w:line="312" w:lineRule="auto"/>
+        <w:pStyle w:val="ListBullet"/>
+        <w:spacing w:line="276" w:lineRule="auto"/>
+        <w:rPr>
+          <w:rFonts w:asciiTheme="majorHAnsi" w:hAnsiTheme="majorHAnsi" w:cstheme="majorHAnsi"/>
+          <w:sz w:val="20"/>
+          <w:szCs w:val="24"/>
+        </w:rPr>
       </w:pPr>
       <w:r>
-        <w:t>2025.12 | Company Special Recognition Award - Smart Hitching Assist development and customer demonstration, HL Mando</w:t>
+        <w:rPr>
+          <w:rFonts w:asciiTheme="majorHAnsi" w:hAnsiTheme="majorHAnsi" w:cstheme="majorHAnsi"/>
+          <w:sz w:val="20"/>
+          <w:szCs w:val="24"/>
+        </w:rPr>
+        <w:t>2025.12 | Company Special Recognition Award - Trailer Hitching Assist development and customer demonstration, HL Mando</w:t>
       </w:r>
     </w:p>
     <w:p>
       <w:pPr>
-        <w:pStyle w:val="ResumeSmall"/>
-        <w:numPr>
-          <w:ilvl w:val="0"/>
-          <w:numId w:val="1"/>
-        </w:numPr>
-        <w:spacing w:line="312" w:lineRule="auto"/>
+        <w:pStyle w:val="ListBullet"/>
+        <w:spacing w:line="276" w:lineRule="auto"/>
+        <w:rPr>
+          <w:rFonts w:asciiTheme="majorHAnsi" w:hAnsiTheme="majorHAnsi" w:cstheme="majorHAnsi"/>
+          <w:sz w:val="20"/>
+          <w:szCs w:val="24"/>
+        </w:rPr>
       </w:pPr>
       <w:r>
-        <w:t>2025.11 | Outstanding Paper Award (Oral Session), Korean Society of Automotive Engineers</w:t>
+        <w:rPr>
+          <w:rFonts w:asciiTheme="majorHAnsi" w:hAnsiTheme="majorHAnsi" w:cstheme="majorHAnsi"/>
+          <w:sz w:val="20"/>
+          <w:szCs w:val="24"/>
+        </w:rPr>
+        <w:t>2025.11 | Outstanding Paper Award (Oral Session), Korean Society of Automotive Engineers (KSAE)</w:t>
       </w:r>
     </w:p>
     <w:p>
       <w:pPr>
-        <w:pStyle w:val="ResumeSmall"/>
-        <w:numPr>
-          <w:ilvl w:val="0"/>
-          <w:numId w:val="1"/>
-        </w:numPr>
-        <w:spacing w:line="312" w:lineRule="auto"/>
+        <w:pStyle w:val="ListBullet"/>
+        <w:spacing w:line="276" w:lineRule="auto"/>
+        <w:rPr>
+          <w:rFonts w:asciiTheme="majorHAnsi" w:hAnsiTheme="majorHAnsi" w:cstheme="majorHAnsi"/>
+          <w:sz w:val="20"/>
+          <w:szCs w:val="24"/>
+        </w:rPr>
       </w:pPr>
       <w:r>
-        <w:t>2024.12 | Excellence Award - R&amp;D Outstanding Paper, HL Mando</w:t>
+        <w:rPr>
+          <w:rFonts w:asciiTheme="majorHAnsi" w:hAnsiTheme="majorHAnsi" w:cstheme="majorHAnsi"/>
+          <w:sz w:val="20"/>
+          <w:szCs w:val="24"/>
+        </w:rPr>
+        <w:t>2024.12 | Excellence Award - Global R&amp;D Tech Congress, HL Mando</w:t>
       </w:r>
     </w:p>
     <w:p>
       <w:pPr>
-        <w:pStyle w:val="ResumeSmall"/>
-        <w:numPr>
-          <w:ilvl w:val="0"/>
-          <w:numId w:val="1"/>
-        </w:numPr>
-        <w:spacing w:line="312" w:lineRule="auto"/>
+        <w:pStyle w:val="ListBullet"/>
+        <w:spacing w:line="276" w:lineRule="auto"/>
+        <w:rPr>
+          <w:rFonts w:asciiTheme="majorHAnsi" w:hAnsiTheme="majorHAnsi" w:cstheme="majorHAnsi"/>
+          <w:sz w:val="20"/>
+          <w:szCs w:val="24"/>
+        </w:rPr>
       </w:pPr>
       <w:r>
-        <w:t>2024.11 | Outstanding Paper Award (Poster Session), Korean Society of Automotive Engineers</w:t>
+        <w:rPr>
+          <w:rFonts w:asciiTheme="majorHAnsi" w:hAnsiTheme="majorHAnsi" w:cstheme="majorHAnsi"/>
+          <w:sz w:val="20"/>
+          <w:szCs w:val="24"/>
+        </w:rPr>
+        <w:t>2024.11 | Outstanding Paper Award (Poster Session), Korean Society of Automotive Engineers (KSAE)</w:t>
       </w:r>
     </w:p>
     <w:p>
       <w:pPr>
-        <w:pStyle w:val="ResumeSmall"/>
-        <w:numPr>
-          <w:ilvl w:val="0"/>
-          <w:numId w:val="1"/>
-        </w:numPr>
-        <w:spacing w:line="312" w:lineRule="auto"/>
+        <w:pStyle w:val="ListBullet"/>
+        <w:spacing w:line="276" w:lineRule="auto"/>
+        <w:rPr>
+          <w:rFonts w:asciiTheme="majorHAnsi" w:hAnsiTheme="majorHAnsi" w:cstheme="majorHAnsi"/>
+          <w:sz w:val="20"/>
+          <w:szCs w:val="24"/>
+        </w:rPr>
       </w:pPr>
       <w:r>
+        <w:rPr>
+          <w:rFonts w:asciiTheme="majorHAnsi" w:hAnsiTheme="majorHAnsi" w:cstheme="majorHAnsi"/>
+          <w:sz w:val="20"/>
+          <w:szCs w:val="24"/>
+        </w:rPr>
         <w:t>2024.03 | Best Dialogue Award, EVS37 International Electric Vehicle Symposium and Exhibition</w:t>
       </w:r>
     </w:p>
     <w:p>
       <w:pPr>
-        <w:pStyle w:val="ResumeSection"/>
+        <w:pStyle w:val="ListBullet"/>
+        <w:spacing w:line="276" w:lineRule="auto"/>
+        <w:rPr>
+          <w:rFonts w:asciiTheme="majorHAnsi" w:hAnsiTheme="majorHAnsi" w:cstheme="majorHAnsi"/>
+          <w:sz w:val="20"/>
+          <w:szCs w:val="24"/>
+        </w:rPr>
+      </w:pPr>
+      <w:r>
+        <w:rPr>
+          <w:rFonts w:asciiTheme="majorHAnsi" w:hAnsiTheme="majorHAnsi" w:cstheme="majorHAnsi"/>
+          <w:sz w:val="20"/>
+          <w:szCs w:val="24"/>
+        </w:rPr>
+        <w:t xml:space="preserve">2020.09 - 2022.08 | </w:t>
+      </w:r>
+      <w:r>
+        <w:rPr>
+          <w:rFonts w:asciiTheme="minorHAnsi" w:eastAsia="Malgun Gothic" w:hAnsiTheme="minorHAnsi" w:cs="Malgun Gothic"/>
+          <w:lang w:eastAsia="ko-KR"/>
+        </w:rPr>
+        <w:t>학술</w:t>
+      </w:r>
+      <w:r>
+        <w:rPr>
+          <w:rFonts w:asciiTheme="minorHAnsi" w:eastAsiaTheme="majorEastAsia" w:hAnsiTheme="minorHAnsi" w:cs="Malgun Gothic"/>
+          <w:lang w:eastAsia="ko-KR"/>
+        </w:rPr>
+        <w:t xml:space="preserve"> </w:t>
+      </w:r>
+      <w:r>
+        <w:rPr>
+          <w:rFonts w:asciiTheme="minorHAnsi" w:eastAsia="Malgun Gothic" w:hAnsiTheme="minorHAnsi" w:cs="Malgun Gothic"/>
+          <w:lang w:eastAsia="ko-KR"/>
+        </w:rPr>
+        <w:t>연수</w:t>
+      </w:r>
+      <w:r>
+        <w:rPr>
+          <w:rFonts w:ascii="Malgun Gothic" w:eastAsia="Malgun Gothic" w:hAnsi="Malgun Gothic" w:cs="Malgun Gothic" w:hint="eastAsia"/>
+          <w:lang w:eastAsia="ko-KR"/>
+        </w:rPr>
+        <w:t xml:space="preserve"> </w:t>
+      </w:r>
+      <w:r>
+        <w:rPr>
+          <w:rFonts w:asciiTheme="majorHAnsi" w:hAnsiTheme="majorHAnsi" w:cstheme="majorHAnsi"/>
+          <w:sz w:val="20"/>
+          <w:szCs w:val="24"/>
+        </w:rPr>
+        <w:t>- Vehicle Dynamics and Control Laboratory, Seoul National University</w:t>
+      </w:r>
+      <w:r>
+        <w:rPr>
+          <w:rFonts w:asciiTheme="majorHAnsi" w:hAnsiTheme="majorHAnsi" w:cstheme="majorHAnsi"/>
+          <w:sz w:val="20"/>
+          <w:szCs w:val="24"/>
+          <w:lang w:eastAsia="ko-KR"/>
+        </w:rPr>
+        <w:t xml:space="preserve">, </w:t>
+      </w:r>
+      <w:r>
+        <w:rPr>
+          <w:rFonts w:asciiTheme="majorHAnsi" w:eastAsia="Malgun Gothic" w:hAnsiTheme="majorHAnsi" w:cstheme="majorHAnsi"/>
+          <w:sz w:val="20"/>
+          <w:szCs w:val="24"/>
+          <w:lang w:eastAsia="ko-KR"/>
+        </w:rPr>
+        <w:t>HL Mando</w:t>
+      </w:r>
+    </w:p>
+    <w:p>
+      <w:pPr>
+        <w:pStyle w:val="ListBullet"/>
+        <w:spacing w:line="276" w:lineRule="auto"/>
+        <w:rPr>
+          <w:rFonts w:asciiTheme="majorHAnsi" w:hAnsiTheme="majorHAnsi" w:cstheme="majorHAnsi"/>
+          <w:sz w:val="20"/>
+          <w:szCs w:val="24"/>
+        </w:rPr>
+      </w:pPr>
+      <w:r>
+        <w:rPr>
+          <w:rFonts w:asciiTheme="majorHAnsi" w:hAnsiTheme="majorHAnsi" w:cstheme="majorHAnsi"/>
+          <w:sz w:val="20"/>
+          <w:szCs w:val="24"/>
+        </w:rPr>
+        <w:t>2017.12 | Grand Prize - Global R&amp;D Tech Congress, HL Mando</w:t>
+      </w:r>
+    </w:p>
+    <w:p>
+      <w:pPr>
+        <w:pStyle w:val="Heading1"/>
         <w:pBdr>
-          <w:bottom w:val="single" w:sz="6" w:space="3" w:color="5A8F00"/>
+          <w:bottom w:val="single" w:sz="6" w:space="4" w:color="5B5BD6"/>
         </w:pBdr>
-        <w:spacing w:line="312" w:lineRule="auto"/>
+        <w:spacing w:before="180" w:after="140" w:line="276" w:lineRule="auto"/>
+        <w:rPr>
+          <w:rFonts w:cstheme="majorHAnsi"/>
+          <w:sz w:val="24"/>
+          <w:szCs w:val="32"/>
+        </w:rPr>
       </w:pPr>
       <w:r>
+        <w:rPr>
+          <w:rFonts w:cstheme="majorHAnsi"/>
+          <w:sz w:val="24"/>
+          <w:szCs w:val="32"/>
+        </w:rPr>
         <w:t>SELECTED PUBLICATIONS &amp; PATENTS</w:t>
       </w:r>
     </w:p>
     <w:p>
       <w:pPr>
-        <w:pStyle w:val="ResumeSmall"/>
-        <w:numPr>
-          <w:ilvl w:val="0"/>
-          <w:numId w:val="1"/>
-        </w:numPr>
-        <w:spacing w:line="312" w:lineRule="auto"/>
+        <w:pStyle w:val="ListBullet"/>
+        <w:spacing w:line="276" w:lineRule="auto"/>
+        <w:rPr>
+          <w:rFonts w:asciiTheme="majorHAnsi" w:hAnsiTheme="majorHAnsi" w:cstheme="majorHAnsi"/>
+          <w:sz w:val="20"/>
+          <w:szCs w:val="24"/>
+        </w:rPr>
       </w:pPr>
       <w:r>
+        <w:rPr>
+          <w:rFonts w:asciiTheme="majorHAnsi" w:hAnsiTheme="majorHAnsi" w:cstheme="majorHAnsi"/>
+          <w:sz w:val="20"/>
+          <w:szCs w:val="24"/>
+        </w:rPr>
         <w:t>K. Lee and J. Seol, "Development of Integrated Chassis Control of Semi-Active Suspension with Differential Brake for Vehicle Lateral Stability," World Electric Vehicle Journal, 16(2):91, 2025.</w:t>
       </w:r>
     </w:p>
     <w:p>
       <w:pPr>
-        <w:pStyle w:val="ResumeSmall"/>
-        <w:numPr>
-          <w:ilvl w:val="0"/>
-          <w:numId w:val="1"/>
-        </w:numPr>
-        <w:spacing w:line="312" w:lineRule="auto"/>
+        <w:pStyle w:val="ListBullet"/>
+        <w:spacing w:line="276" w:lineRule="auto"/>
+        <w:rPr>
+          <w:rFonts w:asciiTheme="majorHAnsi" w:hAnsiTheme="majorHAnsi" w:cstheme="majorHAnsi"/>
+          <w:sz w:val="20"/>
+          <w:szCs w:val="24"/>
+        </w:rPr>
       </w:pPr>
       <w:r>
-        <w:t>K. Lee et al., "Lyapunov-Informed Model Predictive Path Integral Control for Robust Trailer Hitch Assist under Perception Uncertainty," KSAE Annual Conference, 2025.</w:t>
+        <w:rPr>
+          <w:rFonts w:asciiTheme="majorHAnsi" w:hAnsiTheme="majorHAnsi" w:cstheme="majorHAnsi"/>
+          <w:sz w:val="20"/>
+          <w:szCs w:val="24"/>
+        </w:rPr>
+        <w:t>K. Lee et al., "Lyapunov-Informed Model Predictive Path Integral Control for Robust Trailer Hitch Assist under Perception Uncertainty," KSAE Annual Conference Proceedings, 2025.</w:t>
       </w:r>
     </w:p>
     <w:p>
       <w:pPr>
-        <w:pStyle w:val="ResumeSmall"/>
-        <w:numPr>
-          <w:ilvl w:val="0"/>
-          <w:numId w:val="1"/>
-        </w:numPr>
-        <w:spacing w:line="312" w:lineRule="auto"/>
+        <w:pStyle w:val="ListBullet"/>
+        <w:spacing w:line="276" w:lineRule="auto"/>
+        <w:rPr>
+          <w:rFonts w:asciiTheme="majorHAnsi" w:hAnsiTheme="majorHAnsi" w:cstheme="majorHAnsi"/>
+          <w:sz w:val="20"/>
+          <w:szCs w:val="24"/>
+        </w:rPr>
       </w:pPr>
       <w:r>
-        <w:t>K. Lee et al., "Continuous Curvature Path Planning Based on Bezier Curves for Autonomous Driving in Complex Environments," KSAE Annual Conference, 2024.</w:t>
+        <w:rPr>
+          <w:rFonts w:asciiTheme="majorHAnsi" w:hAnsiTheme="majorHAnsi" w:cstheme="majorHAnsi"/>
+          <w:sz w:val="20"/>
+          <w:szCs w:val="24"/>
+        </w:rPr>
+        <w:t>K. Lee et al., "Continuous Curvature Path Planning Based on Bézier Curves for Autonomous Driving in Complex Environments," KSAE Annual Conference Proceedings, 2024.</w:t>
       </w:r>
     </w:p>
     <w:p>
       <w:pPr>
-        <w:pStyle w:val="ResumeSmall"/>
-        <w:numPr>
-          <w:ilvl w:val="0"/>
-          <w:numId w:val="1"/>
-        </w:numPr>
-        <w:spacing w:line="312" w:lineRule="auto"/>
+        <w:pStyle w:val="ListBullet"/>
+        <w:spacing w:line="276" w:lineRule="auto"/>
+        <w:rPr>
+          <w:rFonts w:asciiTheme="majorHAnsi" w:hAnsiTheme="majorHAnsi" w:cstheme="majorHAnsi"/>
+          <w:sz w:val="20"/>
+          <w:szCs w:val="24"/>
+        </w:rPr>
       </w:pPr>
       <w:r>
-        <w:t>Inventor or co-inventor on 19 patent applications spanning automotive chassis, steering, suspension, vehicle-state estimation, trailer assistance, and mechanical systems.</w:t>
+        <w:rPr>
+          <w:rFonts w:asciiTheme="majorHAnsi" w:hAnsiTheme="majorHAnsi" w:cstheme="majorHAnsi"/>
+          <w:sz w:val="20"/>
+          <w:szCs w:val="24"/>
+        </w:rPr>
+        <w:t>K. Lee et al., "Estimation of Vehicle Side Slip Angle Based on Combined Model with Sliding Mode Observer," KSAE Annual Conference Proceedings, 2023.</w:t>
+      </w:r>
+    </w:p>
+    <w:p>
+      <w:pPr>
+        <w:pStyle w:val="ListBullet"/>
+        <w:spacing w:line="276" w:lineRule="auto"/>
+        <w:rPr>
+          <w:rFonts w:asciiTheme="majorHAnsi" w:hAnsiTheme="majorHAnsi" w:cstheme="majorHAnsi"/>
+          <w:sz w:val="20"/>
+          <w:szCs w:val="24"/>
+        </w:rPr>
+      </w:pPr>
+      <w:r>
+        <w:rPr>
+          <w:rFonts w:asciiTheme="majorHAnsi" w:hAnsiTheme="majorHAnsi" w:cstheme="majorHAnsi"/>
+          <w:sz w:val="20"/>
+          <w:szCs w:val="24"/>
+        </w:rPr>
+        <w:t>Patents (filed/granted): Korea 28/11, U.S. 14/4 — automotive chassis, vehicle-state estimation, driving assistance, and mechanical systems.</w:t>
       </w:r>
     </w:p>
     <w:sectPr>
-      <w:footerReference w:type="default" r:id="rId10"/>
-      <w:pgSz w:w="12240" w:h="15840"/>
-      <w:pgMar w:top="835" w:right="835" w:bottom="979" w:left="835" w:header="360" w:footer="403" w:gutter="0"/>
+      <w:footerReference w:type="default" r:id="rId8"/>
+      <w:pgSz w:w="11909" w:h="16834"/>
+      <w:pgMar w:top="737" w:right="907" w:bottom="1247" w:left="907" w:header="720" w:footer="720" w:gutter="0"/>
       <w:cols w:space="720"/>
       <w:docGrid w:linePitch="360"/>
     </w:sectPr>
@@ -830,7 +1701,7 @@
 </file>
 
 <file path=word/endnotes.xml><?xml version="1.0" encoding="utf-8"?>
-<w:endnotes xmlns:wpc="http://schemas.microsoft.com/office/word/2010/wordprocessingCanvas" xmlns:cx="http://schemas.microsoft.com/office/drawing/2014/chartex" xmlns:cx1="http://schemas.microsoft.com/office/drawing/2015/9/8/chartex" xmlns:cx2="http://schemas.microsoft.com/office/drawing/2015/10/21/chartex" xmlns:cx3="http://schemas.microsoft.com/office/drawing/2016/5/9/chartex" xmlns:cx4="http://schemas.microsoft.com/office/drawing/2016/5/10/chartex" xmlns:cx5="http://schemas.microsoft.com/office/drawing/2016/5/11/chartex" xmlns:cx6="http://schemas.microsoft.com/office/drawing/2016/5/12/chartex" xmlns:cx7="http://schemas.microsoft.com/office/drawing/2016/5/13/chartex" xmlns:cx8="http://schemas.microsoft.com/office/drawing/2016/5/14/chartex" xmlns:mc="http://schemas.openxmlformats.org/markup-compatibility/2006" xmlns:m="http://schemas.openxmlformats.org/officeDocument/2006/math" xmlns:aink="http://schemas.microsoft.com/office/drawing/2016/ink" xmlns:am3d="http://schemas.microsoft.com/office/drawing/2017/model3d" xmlns:oel="http://schemas.microsoft.com/office/2019/extlst" xmlns:r="http://schemas.openxmlformats.org/officeDocument/2006/relationships" xmlns:wp14="http://schemas.microsoft.com/office/word/2010/wordprocessingDrawing" xmlns:wp="http://schemas.openxmlformats.org/drawingml/2006/wordprocessingDrawing" xmlns:wpg="http://schemas.microsoft.com/office/word/2010/wordprocessingGroup" xmlns:wpi="http://schemas.microsoft.com/office/word/2010/wordprocessingInk" xmlns:wps="http://schemas.microsoft.com/office/word/2010/wordprocessingShape" xmlns:o="urn:schemas-microsoft-com:office:office" xmlns:v="urn:schemas-microsoft-com:vml" xmlns:w10="urn:schemas-microsoft-com:office:word" xmlns:w="http://schemas.openxmlformats.org/wordprocessingml/2006/main" xmlns:w14="http://schemas.microsoft.com/office/word/2010/wordml" xmlns:w15="http://schemas.microsoft.com/office/word/2012/wordml" xmlns:w16cei="http://schemas.microsoft.com/office/word/2026/wordml/cei" xmlns:w16cex="http://schemas.microsoft.com/office/word/2018/wordml/cex" xmlns:w16cid="http://schemas.microsoft.com/office/word/2016/wordml/cid" xmlns:w16="http://schemas.microsoft.com/office/word/2018/wordml" xmlns:w16sdtdh="http://schemas.microsoft.com/office/word/2020/wordml/sdtdatahash" xmlns:w16sdtfl="http://schemas.microsoft.com/office/word/2024/wordml/sdtformatlock" xmlns:w16se="http://schemas.microsoft.com/office/word/2015/wordml/symex" xmlns:w16du="http://schemas.microsoft.com/office/word/2023/wordml/word16du" xmlns:wne="http://schemas.microsoft.com/office/word/2006/wordml" mc:Ignorable="w14 w15 w16se w16cid w16 w16cex w16sdtdh w16sdtfl w16du wp14">
+<w:endnotes xmlns:wpc="http://schemas.microsoft.com/office/word/2010/wordprocessingCanvas" xmlns:cx="http://schemas.microsoft.com/office/drawing/2014/chartex" xmlns:cx1="http://schemas.microsoft.com/office/drawing/2015/9/8/chartex" xmlns:cx2="http://schemas.microsoft.com/office/drawing/2015/10/21/chartex" xmlns:cx3="http://schemas.microsoft.com/office/drawing/2016/5/9/chartex" xmlns:cx4="http://schemas.microsoft.com/office/drawing/2016/5/10/chartex" xmlns:cx5="http://schemas.microsoft.com/office/drawing/2016/5/11/chartex" xmlns:cx6="http://schemas.microsoft.com/office/drawing/2016/5/12/chartex" xmlns:cx7="http://schemas.microsoft.com/office/drawing/2016/5/13/chartex" xmlns:cx8="http://schemas.microsoft.com/office/drawing/2016/5/14/chartex" xmlns:mc="http://schemas.openxmlformats.org/markup-compatibility/2006" xmlns:m="http://schemas.openxmlformats.org/officeDocument/2006/math" xmlns:aink="http://schemas.microsoft.com/office/drawing/2016/ink" xmlns:am3d="http://schemas.microsoft.com/office/drawing/2017/model3d" xmlns:oel="http://schemas.microsoft.com/office/2019/extlst" xmlns:r="http://schemas.openxmlformats.org/officeDocument/2006/relationships" xmlns:wp14="http://schemas.microsoft.com/office/word/2010/wordprocessingDrawing" xmlns:wp="http://schemas.openxmlformats.org/drawingml/2006/wordprocessingDrawing" xmlns:wpg="http://schemas.microsoft.com/office/word/2010/wordprocessingGroup" xmlns:wpi="http://schemas.microsoft.com/office/word/2010/wordprocessingInk" xmlns:wps="http://schemas.microsoft.com/office/word/2010/wordprocessingShape" xmlns:o="urn:schemas-microsoft-com:office:office" xmlns:v="urn:schemas-microsoft-com:vml" xmlns:w10="urn:schemas-microsoft-com:office:word" xmlns:w="http://schemas.openxmlformats.org/wordprocessingml/2006/main" xmlns:w14="http://schemas.microsoft.com/office/word/2010/wordml" xmlns:w15="http://schemas.microsoft.com/office/word/2012/wordml" xmlns:w16cex="http://schemas.microsoft.com/office/word/2018/wordml/cex" xmlns:w16cid="http://schemas.microsoft.com/office/word/2016/wordml/cid" xmlns:w16="http://schemas.microsoft.com/office/word/2018/wordml" xmlns:w16sdtdh="http://schemas.microsoft.com/office/word/2020/wordml/sdtdatahash" xmlns:w16sdtfl="http://schemas.microsoft.com/office/word/2024/wordml/sdtformatlock" xmlns:w16se="http://schemas.microsoft.com/office/word/2015/wordml/symex" xmlns:w16du="http://schemas.microsoft.com/office/word/2023/wordml/word16du" xmlns:wne="http://schemas.microsoft.com/office/word/2006/wordml" mc:Ignorable="w14 w15 w16se w16cid w16 w16cex w16sdtdh w16sdtfl w16du wp14">
   <w:endnote w:type="separator" w:id="-1">
     <w:p>
       <w:pPr>
@@ -855,63 +1726,48 @@
 </file>
 
 <file path=word/footer1.xml><?xml version="1.0" encoding="utf-8"?>
-<w:ftr xmlns:wpc="http://schemas.microsoft.com/office/word/2010/wordprocessingCanvas" xmlns:cx="http://schemas.microsoft.com/office/drawing/2014/chartex" xmlns:cx1="http://schemas.microsoft.com/office/drawing/2015/9/8/chartex" xmlns:cx2="http://schemas.microsoft.com/office/drawing/2015/10/21/chartex" xmlns:cx3="http://schemas.microsoft.com/office/drawing/2016/5/9/chartex" xmlns:cx4="http://schemas.microsoft.com/office/drawing/2016/5/10/chartex" xmlns:cx5="http://schemas.microsoft.com/office/drawing/2016/5/11/chartex" xmlns:cx6="http://schemas.microsoft.com/office/drawing/2016/5/12/chartex" xmlns:cx7="http://schemas.microsoft.com/office/drawing/2016/5/13/chartex" xmlns:cx8="http://schemas.microsoft.com/office/drawing/2016/5/14/chartex" xmlns:mc="http://schemas.openxmlformats.org/markup-compatibility/2006" xmlns:m="http://schemas.openxmlformats.org/officeDocument/2006/math" xmlns:aink="http://schemas.microsoft.com/office/drawing/2016/ink" xmlns:am3d="http://schemas.microsoft.com/office/drawing/2017/model3d" xmlns:oel="http://schemas.microsoft.com/office/2019/extlst" xmlns:r="http://schemas.openxmlformats.org/officeDocument/2006/relationships" xmlns:wp14="http://schemas.microsoft.com/office/word/2010/wordprocessingDrawing" xmlns:wp="http://schemas.openxmlformats.org/drawingml/2006/wordprocessingDrawing" xmlns:wpg="http://schemas.microsoft.com/office/word/2010/wordprocessingGroup" xmlns:wpi="http://schemas.microsoft.com/office/word/2010/wordprocessingInk" xmlns:wps="http://schemas.microsoft.com/office/word/2010/wordprocessingShape" xmlns:o="urn:schemas-microsoft-com:office:office" xmlns:v="urn:schemas-microsoft-com:vml" xmlns:w10="urn:schemas-microsoft-com:office:word" xmlns:w="http://schemas.openxmlformats.org/wordprocessingml/2006/main" xmlns:w14="http://schemas.microsoft.com/office/word/2010/wordml" xmlns:w15="http://schemas.microsoft.com/office/word/2012/wordml" xmlns:w16cei="http://schemas.microsoft.com/office/word/2026/wordml/cei" xmlns:w16cex="http://schemas.microsoft.com/office/word/2018/wordml/cex" xmlns:w16cid="http://schemas.microsoft.com/office/word/2016/wordml/cid" xmlns:w16="http://schemas.microsoft.com/office/word/2018/wordml" xmlns:w16sdtdh="http://schemas.microsoft.com/office/word/2020/wordml/sdtdatahash" xmlns:w16sdtfl="http://schemas.microsoft.com/office/word/2024/wordml/sdtformatlock" xmlns:w16se="http://schemas.microsoft.com/office/word/2015/wordml/symex" xmlns:w16du="http://schemas.microsoft.com/office/word/2023/wordml/word16du" xmlns:wne="http://schemas.microsoft.com/office/word/2006/wordml" mc:Ignorable="w14 w15 w16se w16cid w16 w16cex w16sdtdh w16sdtfl w16du wp14">
+<w:ftr xmlns:wpc="http://schemas.microsoft.com/office/word/2010/wordprocessingCanvas" xmlns:cx="http://schemas.microsoft.com/office/drawing/2014/chartex" xmlns:cx1="http://schemas.microsoft.com/office/drawing/2015/9/8/chartex" xmlns:cx2="http://schemas.microsoft.com/office/drawing/2015/10/21/chartex" xmlns:cx3="http://schemas.microsoft.com/office/drawing/2016/5/9/chartex" xmlns:cx4="http://schemas.microsoft.com/office/drawing/2016/5/10/chartex" xmlns:cx5="http://schemas.microsoft.com/office/drawing/2016/5/11/chartex" xmlns:cx6="http://schemas.microsoft.com/office/drawing/2016/5/12/chartex" xmlns:cx7="http://schemas.microsoft.com/office/drawing/2016/5/13/chartex" xmlns:cx8="http://schemas.microsoft.com/office/drawing/2016/5/14/chartex" xmlns:mc="http://schemas.openxmlformats.org/markup-compatibility/2006" xmlns:m="http://schemas.openxmlformats.org/officeDocument/2006/math" xmlns:aink="http://schemas.microsoft.com/office/drawing/2016/ink" xmlns:am3d="http://schemas.microsoft.com/office/drawing/2017/model3d" xmlns:oel="http://schemas.microsoft.com/office/2019/extlst" xmlns:r="http://schemas.openxmlformats.org/officeDocument/2006/relationships" xmlns:wp14="http://schemas.microsoft.com/office/word/2010/wordprocessingDrawing" xmlns:wp="http://schemas.openxmlformats.org/drawingml/2006/wordprocessingDrawing" xmlns:wpg="http://schemas.microsoft.com/office/word/2010/wordprocessingGroup" xmlns:wpi="http://schemas.microsoft.com/office/word/2010/wordprocessingInk" xmlns:wps="http://schemas.microsoft.com/office/word/2010/wordprocessingShape" xmlns:o="urn:schemas-microsoft-com:office:office" xmlns:v="urn:schemas-microsoft-com:vml" xmlns:w10="urn:schemas-microsoft-com:office:word" xmlns:w="http://schemas.openxmlformats.org/wordprocessingml/2006/main" xmlns:w14="http://schemas.microsoft.com/office/word/2010/wordml" xmlns:w15="http://schemas.microsoft.com/office/word/2012/wordml" xmlns:w16cex="http://schemas.microsoft.com/office/word/2018/wordml/cex" xmlns:w16cid="http://schemas.microsoft.com/office/word/2016/wordml/cid" xmlns:w16="http://schemas.microsoft.com/office/word/2018/wordml" xmlns:w16sdtdh="http://schemas.microsoft.com/office/word/2020/wordml/sdtdatahash" xmlns:w16sdtfl="http://schemas.microsoft.com/office/word/2024/wordml/sdtformatlock" xmlns:w16se="http://schemas.microsoft.com/office/word/2015/wordml/symex" xmlns:w16du="http://schemas.microsoft.com/office/word/2023/wordml/word16du" xmlns:wne="http://schemas.microsoft.com/office/word/2006/wordml" mc:Ignorable="w14 w15 w16se w16cid w16 w16cex w16sdtdh w16sdtfl w16du wp14">
   <w:p>
     <w:pPr>
       <w:pStyle w:val="Footer"/>
       <w:pBdr>
-        <w:bottom w:val="single" w:sz="3" w:space="2" w:color="D8DEE5"/>
+        <w:top w:val="single" w:sz="3" w:space="5" w:color="D8DEE5"/>
       </w:pBdr>
       <w:tabs>
-        <w:tab w:val="right" w:pos="10570"/>
+        <w:tab w:val="center" w:pos="5046"/>
       </w:tabs>
-      <w:spacing w:before="40"/>
     </w:pPr>
     <w:r>
       <w:rPr>
         <w:color w:val="56616D"/>
-        <w:sz w:val="16"/>
+        <w:sz w:val="15"/>
       </w:rPr>
       <w:t>Kyungtack Lee | Resume</w:t>
     </w:r>
     <w:r>
+      <w:rPr>
+        <w:color w:val="56616D"/>
+        <w:sz w:val="15"/>
+      </w:rPr>
       <w:tab/>
       <w:t xml:space="preserve">Page </w:t>
     </w:r>
     <w:r>
-      <w:rPr>
-        <w:color w:val="56616D"/>
-        <w:sz w:val="16"/>
-      </w:rPr>
       <w:fldChar w:fldCharType="begin"/>
     </w:r>
     <w:r>
-      <w:rPr>
-        <w:color w:val="56616D"/>
-        <w:sz w:val="16"/>
-      </w:rPr>
-      <w:instrText xml:space="preserve"> PAGE </w:instrText>
+      <w:instrText>PAGE</w:instrText>
     </w:r>
     <w:r>
-      <w:rPr>
-        <w:color w:val="56616D"/>
-        <w:sz w:val="16"/>
-      </w:rPr>
       <w:fldChar w:fldCharType="separate"/>
     </w:r>
     <w:r>
       <w:rPr>
         <w:noProof/>
-        <w:color w:val="56616D"/>
-        <w:sz w:val="16"/>
       </w:rPr>
       <w:t>1</w:t>
     </w:r>
     <w:r>
-      <w:rPr>
-        <w:color w:val="56616D"/>
-        <w:sz w:val="16"/>
-      </w:rPr>
       <w:fldChar w:fldCharType="end"/>
     </w:r>
   </w:p>
@@ -919,7 +1775,7 @@
 </file>
 
 <file path=word/footnotes.xml><?xml version="1.0" encoding="utf-8"?>
-<w:footnotes xmlns:wpc="http://schemas.microsoft.com/office/word/2010/wordprocessingCanvas" xmlns:cx="http://schemas.microsoft.com/office/drawing/2014/chartex" xmlns:cx1="http://schemas.microsoft.com/office/drawing/2015/9/8/chartex" xmlns:cx2="http://schemas.microsoft.com/office/drawing/2015/10/21/chartex" xmlns:cx3="http://schemas.microsoft.com/office/drawing/2016/5/9/chartex" xmlns:cx4="http://schemas.microsoft.com/office/drawing/2016/5/10/chartex" xmlns:cx5="http://schemas.microsoft.com/office/drawing/2016/5/11/chartex" xmlns:cx6="http://schemas.microsoft.com/office/drawing/2016/5/12/chartex" xmlns:cx7="http://schemas.microsoft.com/office/drawing/2016/5/13/chartex" xmlns:cx8="http://schemas.microsoft.com/office/drawing/2016/5/14/chartex" xmlns:mc="http://schemas.openxmlformats.org/markup-compatibility/2006" xmlns:m="http://schemas.openxmlformats.org/officeDocument/2006/math" xmlns:aink="http://schemas.microsoft.com/office/drawing/2016/ink" xmlns:am3d="http://schemas.microsoft.com/office/drawing/2017/model3d" xmlns:oel="http://schemas.microsoft.com/office/2019/extlst" xmlns:r="http://schemas.openxmlformats.org/officeDocument/2006/relationships" xmlns:wp14="http://schemas.microsoft.com/office/word/2010/wordprocessingDrawing" xmlns:wp="http://schemas.openxmlformats.org/drawingml/2006/wordprocessingDrawing" xmlns:wpg="http://schemas.microsoft.com/office/word/2010/wordprocessingGroup" xmlns:wpi="http://schemas.microsoft.com/office/word/2010/wordprocessingInk" xmlns:wps="http://schemas.microsoft.com/office/word/2010/wordprocessingShape" xmlns:o="urn:schemas-microsoft-com:office:office" xmlns:v="urn:schemas-microsoft-com:vml" xmlns:w10="urn:schemas-microsoft-com:office:word" xmlns:w="http://schemas.openxmlformats.org/wordprocessingml/2006/main" xmlns:w14="http://schemas.microsoft.com/office/word/2010/wordml" xmlns:w15="http://schemas.microsoft.com/office/word/2012/wordml" xmlns:w16cei="http://schemas.microsoft.com/office/word/2026/wordml/cei" xmlns:w16cex="http://schemas.microsoft.com/office/word/2018/wordml/cex" xmlns:w16cid="http://schemas.microsoft.com/office/word/2016/wordml/cid" xmlns:w16="http://schemas.microsoft.com/office/word/2018/wordml" xmlns:w16sdtdh="http://schemas.microsoft.com/office/word/2020/wordml/sdtdatahash" xmlns:w16sdtfl="http://schemas.microsoft.com/office/word/2024/wordml/sdtformatlock" xmlns:w16se="http://schemas.microsoft.com/office/word/2015/wordml/symex" xmlns:w16du="http://schemas.microsoft.com/office/word/2023/wordml/word16du" xmlns:wne="http://schemas.microsoft.com/office/word/2006/wordml" mc:Ignorable="w14 w15 w16se w16cid w16 w16cex w16sdtdh w16sdtfl w16du wp14">
+<w:footnotes xmlns:wpc="http://schemas.microsoft.com/office/word/2010/wordprocessingCanvas" xmlns:cx="http://schemas.microsoft.com/office/drawing/2014/chartex" xmlns:cx1="http://schemas.microsoft.com/office/drawing/2015/9/8/chartex" xmlns:cx2="http://schemas.microsoft.com/office/drawing/2015/10/21/chartex" xmlns:cx3="http://schemas.microsoft.com/office/drawing/2016/5/9/chartex" xmlns:cx4="http://schemas.microsoft.com/office/drawing/2016/5/10/chartex" xmlns:cx5="http://schemas.microsoft.com/office/drawing/2016/5/11/chartex" xmlns:cx6="http://schemas.microsoft.com/office/drawing/2016/5/12/chartex" xmlns:cx7="http://schemas.microsoft.com/office/drawing/2016/5/13/chartex" xmlns:cx8="http://schemas.microsoft.com/office/drawing/2016/5/14/chartex" xmlns:mc="http://schemas.openxmlformats.org/markup-compatibility/2006" xmlns:m="http://schemas.openxmlformats.org/officeDocument/2006/math" xmlns:aink="http://schemas.microsoft.com/office/drawing/2016/ink" xmlns:am3d="http://schemas.microsoft.com/office/drawing/2017/model3d" xmlns:oel="http://schemas.microsoft.com/office/2019/extlst" xmlns:r="http://schemas.openxmlformats.org/officeDocument/2006/relationships" xmlns:wp14="http://schemas.microsoft.com/office/word/2010/wordprocessingDrawing" xmlns:wp="http://schemas.openxmlformats.org/drawingml/2006/wordprocessingDrawing" xmlns:wpg="http://schemas.microsoft.com/office/word/2010/wordprocessingGroup" xmlns:wpi="http://schemas.microsoft.com/office/word/2010/wordprocessingInk" xmlns:wps="http://schemas.microsoft.com/office/word/2010/wordprocessingShape" xmlns:o="urn:schemas-microsoft-com:office:office" xmlns:v="urn:schemas-microsoft-com:vml" xmlns:w10="urn:schemas-microsoft-com:office:word" xmlns:w="http://schemas.openxmlformats.org/wordprocessingml/2006/main" xmlns:w14="http://schemas.microsoft.com/office/word/2010/wordml" xmlns:w15="http://schemas.microsoft.com/office/word/2012/wordml" xmlns:w16cex="http://schemas.microsoft.com/office/word/2018/wordml/cex" xmlns:w16cid="http://schemas.microsoft.com/office/word/2016/wordml/cid" xmlns:w16="http://schemas.microsoft.com/office/word/2018/wordml" xmlns:w16sdtdh="http://schemas.microsoft.com/office/word/2020/wordml/sdtdatahash" xmlns:w16sdtfl="http://schemas.microsoft.com/office/word/2024/wordml/sdtformatlock" xmlns:w16se="http://schemas.microsoft.com/office/word/2015/wordml/symex" xmlns:w16du="http://schemas.microsoft.com/office/word/2023/wordml/word16du" xmlns:wne="http://schemas.microsoft.com/office/word/2006/wordml" mc:Ignorable="w14 w15 w16se w16cid w16 w16cex w16sdtdh w16sdtfl w16du wp14">
   <w:footnote w:type="separator" w:id="-1">
     <w:p>
       <w:pPr>
@@ -944,7 +1800,7 @@
 </file>
 
 <file path=word/numbering.xml><?xml version="1.0" encoding="utf-8"?>
-<w:numbering xmlns:wpc="http://schemas.microsoft.com/office/word/2010/wordprocessingCanvas" xmlns:cx="http://schemas.microsoft.com/office/drawing/2014/chartex" xmlns:cx1="http://schemas.microsoft.com/office/drawing/2015/9/8/chartex" xmlns:cx2="http://schemas.microsoft.com/office/drawing/2015/10/21/chartex" xmlns:cx3="http://schemas.microsoft.com/office/drawing/2016/5/9/chartex" xmlns:cx4="http://schemas.microsoft.com/office/drawing/2016/5/10/chartex" xmlns:cx5="http://schemas.microsoft.com/office/drawing/2016/5/11/chartex" xmlns:cx6="http://schemas.microsoft.com/office/drawing/2016/5/12/chartex" xmlns:cx7="http://schemas.microsoft.com/office/drawing/2016/5/13/chartex" xmlns:cx8="http://schemas.microsoft.com/office/drawing/2016/5/14/chartex" xmlns:mc="http://schemas.openxmlformats.org/markup-compatibility/2006" xmlns:m="http://schemas.openxmlformats.org/officeDocument/2006/math" xmlns:aink="http://schemas.microsoft.com/office/drawing/2016/ink" xmlns:am3d="http://schemas.microsoft.com/office/drawing/2017/model3d" xmlns:oel="http://schemas.microsoft.com/office/2019/extlst" xmlns:r="http://schemas.openxmlformats.org/officeDocument/2006/relationships" xmlns:wp14="http://schemas.microsoft.com/office/word/2010/wordprocessingDrawing" xmlns:wp="http://schemas.openxmlformats.org/drawingml/2006/wordprocessingDrawing" xmlns:wpg="http://schemas.microsoft.com/office/word/2010/wordprocessingGroup" xmlns:wpi="http://schemas.microsoft.com/office/word/2010/wordprocessingInk" xmlns:wps="http://schemas.microsoft.com/office/word/2010/wordprocessingShape" xmlns:o="urn:schemas-microsoft-com:office:office" xmlns:v="urn:schemas-microsoft-com:vml" xmlns:w10="urn:schemas-microsoft-com:office:word" xmlns:w="http://schemas.openxmlformats.org/wordprocessingml/2006/main" xmlns:w14="http://schemas.microsoft.com/office/word/2010/wordml" xmlns:w15="http://schemas.microsoft.com/office/word/2012/wordml" xmlns:w16cei="http://schemas.microsoft.com/office/word/2026/wordml/cei" xmlns:w16cex="http://schemas.microsoft.com/office/word/2018/wordml/cex" xmlns:w16cid="http://schemas.microsoft.com/office/word/2016/wordml/cid" xmlns:w16="http://schemas.microsoft.com/office/word/2018/wordml" xmlns:w16sdtdh="http://schemas.microsoft.com/office/word/2020/wordml/sdtdatahash" xmlns:w16sdtfl="http://schemas.microsoft.com/office/word/2024/wordml/sdtformatlock" xmlns:w16se="http://schemas.microsoft.com/office/word/2015/wordml/symex" xmlns:w16du="http://schemas.microsoft.com/office/word/2023/wordml/word16du" xmlns:wne="http://schemas.microsoft.com/office/word/2006/wordml" mc:Ignorable="w14 w15 w16se w16cid w16 w16cex w16sdtdh w16sdtfl w16du wp14">
+<w:numbering xmlns:wpc="http://schemas.microsoft.com/office/word/2010/wordprocessingCanvas" xmlns:cx="http://schemas.microsoft.com/office/drawing/2014/chartex" xmlns:cx1="http://schemas.microsoft.com/office/drawing/2015/9/8/chartex" xmlns:cx2="http://schemas.microsoft.com/office/drawing/2015/10/21/chartex" xmlns:cx3="http://schemas.microsoft.com/office/drawing/2016/5/9/chartex" xmlns:cx4="http://schemas.microsoft.com/office/drawing/2016/5/10/chartex" xmlns:cx5="http://schemas.microsoft.com/office/drawing/2016/5/11/chartex" xmlns:cx6="http://schemas.microsoft.com/office/drawing/2016/5/12/chartex" xmlns:cx7="http://schemas.microsoft.com/office/drawing/2016/5/13/chartex" xmlns:cx8="http://schemas.microsoft.com/office/drawing/2016/5/14/chartex" xmlns:mc="http://schemas.openxmlformats.org/markup-compatibility/2006" xmlns:m="http://schemas.openxmlformats.org/officeDocument/2006/math" xmlns:aink="http://schemas.microsoft.com/office/drawing/2016/ink" xmlns:am3d="http://schemas.microsoft.com/office/drawing/2017/model3d" xmlns:oel="http://schemas.microsoft.com/office/2019/extlst" xmlns:r="http://schemas.openxmlformats.org/officeDocument/2006/relationships" xmlns:wp14="http://schemas.microsoft.com/office/word/2010/wordprocessingDrawing" xmlns:wp="http://schemas.openxmlformats.org/drawingml/2006/wordprocessingDrawing" xmlns:wpg="http://schemas.microsoft.com/office/word/2010/wordprocessingGroup" xmlns:wpi="http://schemas.microsoft.com/office/word/2010/wordprocessingInk" xmlns:wps="http://schemas.microsoft.com/office/word/2010/wordprocessingShape" xmlns:o="urn:schemas-microsoft-com:office:office" xmlns:v="urn:schemas-microsoft-com:vml" xmlns:w10="urn:schemas-microsoft-com:office:word" xmlns:w="http://schemas.openxmlformats.org/wordprocessingml/2006/main" xmlns:w14="http://schemas.microsoft.com/office/word/2010/wordml" xmlns:w15="http://schemas.microsoft.com/office/word/2012/wordml" xmlns:w16cex="http://schemas.microsoft.com/office/word/2018/wordml/cex" xmlns:w16cid="http://schemas.microsoft.com/office/word/2016/wordml/cid" xmlns:w16="http://schemas.microsoft.com/office/word/2018/wordml" xmlns:w16sdtdh="http://schemas.microsoft.com/office/word/2020/wordml/sdtdatahash" xmlns:w16sdtfl="http://schemas.microsoft.com/office/word/2024/wordml/sdtformatlock" xmlns:w16se="http://schemas.microsoft.com/office/word/2015/wordml/symex" xmlns:w16du="http://schemas.microsoft.com/office/word/2023/wordml/word16du" xmlns:wne="http://schemas.microsoft.com/office/word/2006/wordml" mc:Ignorable="w14 w15 w16se w16cid w16 w16cex w16sdtdh w16sdtfl w16du wp14">
   <w:abstractNum w:abstractNumId="0" w15:restartNumberingAfterBreak="0">
     <w:nsid w:val="FFFFFF7C"/>
     <w:multiLevelType w:val="singleLevel"/>
@@ -986,6 +1842,7 @@
     <w:lvl w:ilvl="0">
       <w:start w:val="1"/>
       <w:numFmt w:val="decimal"/>
+      <w:pStyle w:val="ListNumber3"/>
       <w:lvlText w:val="%1."/>
       <w:lvlJc w:val="left"/>
       <w:pPr>
@@ -1003,6 +1860,7 @@
     <w:lvl w:ilvl="0">
       <w:start w:val="1"/>
       <w:numFmt w:val="decimal"/>
+      <w:pStyle w:val="ListNumber2"/>
       <w:lvlText w:val="%1."/>
       <w:lvlJc w:val="left"/>
       <w:pPr>
@@ -1040,6 +1898,7 @@
     <w:lvl w:ilvl="0">
       <w:start w:val="1"/>
       <w:numFmt w:val="bullet"/>
+      <w:pStyle w:val="ListBullet3"/>
       <w:lvlText w:val=""/>
       <w:lvlJc w:val="left"/>
       <w:pPr>
@@ -1060,6 +1919,7 @@
     <w:lvl w:ilvl="0">
       <w:start w:val="1"/>
       <w:numFmt w:val="bullet"/>
+      <w:pStyle w:val="ListBullet2"/>
       <w:lvlText w:val=""/>
       <w:lvlJc w:val="left"/>
       <w:pPr>
@@ -1080,6 +1940,7 @@
     <w:lvl w:ilvl="0">
       <w:start w:val="1"/>
       <w:numFmt w:val="decimal"/>
+      <w:pStyle w:val="ListNumber"/>
       <w:lvlText w:val="%1."/>
       <w:lvlJc w:val="left"/>
       <w:pPr>
@@ -1097,6 +1958,7 @@
     <w:lvl w:ilvl="0">
       <w:start w:val="1"/>
       <w:numFmt w:val="bullet"/>
+      <w:pStyle w:val="ListBullet"/>
       <w:lvlText w:val=""/>
       <w:lvlJc w:val="left"/>
       <w:pPr>
@@ -1110,30 +1972,32 @@
       </w:rPr>
     </w:lvl>
   </w:abstractNum>
-  <w:abstractNum w:abstractNumId="9" w15:restartNumberingAfterBreak="0">
-    <w:nsid w:val="229F5893"/>
-    <w:multiLevelType w:val="singleLevel"/>
-    <w:tmpl w:val="878C7E24"/>
-    <w:lvl w:ilvl="0">
-      <w:start w:val="1"/>
-      <w:numFmt w:val="bullet"/>
-      <w:pStyle w:val="ListBullet"/>
-      <w:lvlText w:val="•"/>
-      <w:lvlJc w:val="left"/>
-      <w:pPr>
-        <w:tabs>
-          <w:tab w:val="num" w:pos="270"/>
-        </w:tabs>
-        <w:spacing w:after="40" w:line="252" w:lineRule="auto"/>
-        <w:ind w:left="540" w:hanging="270"/>
-      </w:pPr>
-      <w:rPr>
-        <w:rFonts w:ascii="Arial" w:hAnsi="Arial"/>
-      </w:rPr>
-    </w:lvl>
-  </w:abstractNum>
-  <w:num w:numId="1" w16cid:durableId="1763064933">
-    <w:abstractNumId w:val="9"/>
+  <w:num w:numId="1" w16cid:durableId="1350831255">
+    <w:abstractNumId w:val="8"/>
+  </w:num>
+  <w:num w:numId="2" w16cid:durableId="108597245">
+    <w:abstractNumId w:val="6"/>
+  </w:num>
+  <w:num w:numId="3" w16cid:durableId="131289943">
+    <w:abstractNumId w:val="5"/>
+  </w:num>
+  <w:num w:numId="4" w16cid:durableId="410585854">
+    <w:abstractNumId w:val="4"/>
+  </w:num>
+  <w:num w:numId="5" w16cid:durableId="2112315652">
+    <w:abstractNumId w:val="7"/>
+  </w:num>
+  <w:num w:numId="6" w16cid:durableId="1288271862">
+    <w:abstractNumId w:val="3"/>
+  </w:num>
+  <w:num w:numId="7" w16cid:durableId="1036077667">
+    <w:abstractNumId w:val="2"/>
+  </w:num>
+  <w:num w:numId="8" w16cid:durableId="204342641">
+    <w:abstractNumId w:val="1"/>
+  </w:num>
+  <w:num w:numId="9" w16cid:durableId="894661398">
+    <w:abstractNumId w:val="0"/>
   </w:num>
 </w:numbering>
 </file>
@@ -1529,12 +2393,12 @@
     <w:qFormat/>
     <w:rsid w:val="00FC693F"/>
     <w:pPr>
-      <w:spacing w:after="40" w:line="252" w:lineRule="auto"/>
+      <w:spacing w:after="60" w:line="252" w:lineRule="auto"/>
     </w:pPr>
     <w:rPr>
       <w:rFonts w:ascii="Arial" w:hAnsi="Arial"/>
       <w:color w:val="20262E"/>
-      <w:sz w:val="19"/>
+      <w:sz w:val="18"/>
     </w:rPr>
   </w:style>
   <w:style w:type="paragraph" w:styleId="Heading1">
@@ -1548,15 +2412,15 @@
     <w:pPr>
       <w:keepNext/>
       <w:keepLines/>
-      <w:spacing w:before="480" w:after="0"/>
+      <w:spacing w:before="160" w:after="80"/>
       <w:outlineLvl w:val="0"/>
     </w:pPr>
     <w:rPr>
       <w:rFonts w:asciiTheme="majorHAnsi" w:eastAsiaTheme="majorEastAsia" w:hAnsiTheme="majorHAnsi" w:cstheme="majorBidi"/>
       <w:b/>
       <w:bCs/>
-      <w:color w:val="365F91" w:themeColor="accent1" w:themeShade="BF"/>
-      <w:sz w:val="28"/>
+      <w:color w:val="17324D"/>
+      <w:sz w:val="22"/>
       <w:szCs w:val="28"/>
     </w:rPr>
   </w:style>
@@ -1572,15 +2436,14 @@
     <w:pPr>
       <w:keepNext/>
       <w:keepLines/>
-      <w:spacing w:before="200" w:after="0"/>
+      <w:spacing w:before="160" w:after="80"/>
       <w:outlineLvl w:val="1"/>
     </w:pPr>
     <w:rPr>
       <w:rFonts w:asciiTheme="majorHAnsi" w:eastAsiaTheme="majorEastAsia" w:hAnsiTheme="majorHAnsi" w:cstheme="majorBidi"/>
       <w:b/>
       <w:bCs/>
-      <w:color w:val="4F81BD" w:themeColor="accent1"/>
-      <w:sz w:val="26"/>
+      <w:sz w:val="19"/>
       <w:szCs w:val="26"/>
     </w:rPr>
   </w:style>
@@ -1878,18 +2741,16 @@
     <w:qFormat/>
     <w:rsid w:val="00FC693F"/>
     <w:pPr>
-      <w:pBdr>
-        <w:bottom w:val="single" w:sz="8" w:space="4" w:color="4F81BD" w:themeColor="accent1"/>
-      </w:pBdr>
-      <w:spacing w:after="300" w:line="240" w:lineRule="auto"/>
+      <w:keepNext/>
+      <w:spacing w:before="160" w:after="80" w:line="240" w:lineRule="auto"/>
       <w:contextualSpacing/>
     </w:pPr>
     <w:rPr>
       <w:rFonts w:asciiTheme="majorHAnsi" w:eastAsiaTheme="majorEastAsia" w:hAnsiTheme="majorHAnsi" w:cstheme="majorBidi"/>
-      <w:color w:val="17365D" w:themeColor="text2" w:themeShade="BF"/>
+      <w:color w:val="17324D"/>
       <w:spacing w:val="5"/>
       <w:kern w:val="28"/>
-      <w:sz w:val="52"/>
+      <w:sz w:val="44"/>
       <w:szCs w:val="52"/>
     </w:rPr>
   </w:style>
@@ -2073,9 +2934,9 @@
     <w:unhideWhenUsed/>
     <w:rsid w:val="00326F90"/>
     <w:pPr>
-      <w:tabs>
-        <w:tab w:val="num" w:pos="360"/>
-      </w:tabs>
+      <w:numPr>
+        <w:numId w:val="2"/>
+      </w:numPr>
       <w:contextualSpacing/>
     </w:pPr>
   </w:style>
@@ -2086,9 +2947,9 @@
     <w:unhideWhenUsed/>
     <w:rsid w:val="00326F90"/>
     <w:pPr>
-      <w:tabs>
-        <w:tab w:val="num" w:pos="360"/>
-      </w:tabs>
+      <w:numPr>
+        <w:numId w:val="3"/>
+      </w:numPr>
       <w:contextualSpacing/>
     </w:pPr>
   </w:style>
@@ -2099,9 +2960,9 @@
     <w:unhideWhenUsed/>
     <w:rsid w:val="00326F90"/>
     <w:pPr>
-      <w:tabs>
-        <w:tab w:val="num" w:pos="360"/>
-      </w:tabs>
+      <w:numPr>
+        <w:numId w:val="5"/>
+      </w:numPr>
       <w:contextualSpacing/>
     </w:pPr>
   </w:style>
@@ -2112,9 +2973,9 @@
     <w:unhideWhenUsed/>
     <w:rsid w:val="0029639D"/>
     <w:pPr>
-      <w:tabs>
-        <w:tab w:val="num" w:pos="360"/>
-      </w:tabs>
+      <w:numPr>
+        <w:numId w:val="6"/>
+      </w:numPr>
       <w:contextualSpacing/>
     </w:pPr>
   </w:style>
@@ -2125,9 +2986,9 @@
     <w:unhideWhenUsed/>
     <w:rsid w:val="0029639D"/>
     <w:pPr>
-      <w:tabs>
-        <w:tab w:val="num" w:pos="360"/>
-      </w:tabs>
+      <w:numPr>
+        <w:numId w:val="7"/>
+      </w:numPr>
       <w:contextualSpacing/>
     </w:pPr>
   </w:style>
@@ -2330,7 +3191,6 @@
       <w:b/>
       <w:bCs/>
       <w:color w:val="4F81BD" w:themeColor="accent1"/>
-      <w:sz w:val="18"/>
       <w:szCs w:val="18"/>
     </w:rPr>
   </w:style>
@@ -2365,9 +3225,6 @@
     <w:qFormat/>
     <w:rsid w:val="00FC693F"/>
     <w:pPr>
-      <w:pBdr>
-        <w:bottom w:val="single" w:sz="4" w:space="4" w:color="4F81BD" w:themeColor="accent1"/>
-      </w:pBdr>
       <w:spacing w:before="200" w:after="280"/>
       <w:ind w:left="936" w:right="936"/>
     </w:pPr>
@@ -12525,77 +13382,6 @@
         <w:shd w:val="clear" w:color="auto" w:fill="FBCAA2" w:themeFill="accent6" w:themeFillTint="7F"/>
       </w:tcPr>
     </w:tblStylePr>
-  </w:style>
-  <w:style w:type="paragraph" w:customStyle="1" w:styleId="ResumeName">
-    <w:name w:val="Resume Name"/>
-    <w:pPr>
-      <w:spacing w:after="0" w:line="247" w:lineRule="auto"/>
-    </w:pPr>
-    <w:rPr>
-      <w:rFonts w:ascii="Arial" w:hAnsi="Arial"/>
-      <w:color w:val="17324D"/>
-      <w:sz w:val="44"/>
-    </w:rPr>
-  </w:style>
-  <w:style w:type="paragraph" w:customStyle="1" w:styleId="ResumeTagline">
-    <w:name w:val="Resume Tagline"/>
-    <w:pPr>
-      <w:spacing w:after="40" w:line="247" w:lineRule="auto"/>
-    </w:pPr>
-    <w:rPr>
-      <w:rFonts w:ascii="Arial" w:hAnsi="Arial"/>
-      <w:b/>
-      <w:color w:val="5A8F00"/>
-      <w:sz w:val="21"/>
-    </w:rPr>
-  </w:style>
-  <w:style w:type="paragraph" w:customStyle="1" w:styleId="ResumeContact">
-    <w:name w:val="Resume Contact"/>
-    <w:pPr>
-      <w:spacing w:after="100" w:line="247" w:lineRule="auto"/>
-    </w:pPr>
-    <w:rPr>
-      <w:rFonts w:ascii="Arial" w:hAnsi="Arial"/>
-      <w:color w:val="56616D"/>
-      <w:sz w:val="17"/>
-    </w:rPr>
-  </w:style>
-  <w:style w:type="paragraph" w:customStyle="1" w:styleId="ResumeSection">
-    <w:name w:val="Resume Section"/>
-    <w:pPr>
-      <w:keepNext/>
-      <w:spacing w:before="140" w:after="60" w:line="247" w:lineRule="auto"/>
-    </w:pPr>
-    <w:rPr>
-      <w:rFonts w:ascii="Arial" w:hAnsi="Arial"/>
-      <w:b/>
-      <w:color w:val="17324D"/>
-      <w:sz w:val="23"/>
-    </w:rPr>
-  </w:style>
-  <w:style w:type="paragraph" w:customStyle="1" w:styleId="ResumeEntry">
-    <w:name w:val="Resume Entry"/>
-    <w:pPr>
-      <w:keepNext/>
-      <w:spacing w:before="60" w:after="20" w:line="247" w:lineRule="auto"/>
-    </w:pPr>
-    <w:rPr>
-      <w:rFonts w:ascii="Arial" w:hAnsi="Arial"/>
-      <w:b/>
-      <w:color w:val="20262E"/>
-      <w:sz w:val="20"/>
-    </w:rPr>
-  </w:style>
-  <w:style w:type="paragraph" w:customStyle="1" w:styleId="ResumeSmall">
-    <w:name w:val="Resume Small"/>
-    <w:pPr>
-      <w:spacing w:after="20" w:line="247" w:lineRule="auto"/>
-    </w:pPr>
-    <w:rPr>
-      <w:rFonts w:ascii="Arial" w:hAnsi="Arial"/>
-      <w:color w:val="20262E"/>
-      <w:sz w:val="17"/>
-    </w:rPr>
   </w:style>
 </w:styles>
 </file>

</xml_diff>